<commit_message>
Added more inputs (pdf and ppt) and outputs
</commit_message>
<xml_diff>
--- a/outputs/brd_single.docx
+++ b/outputs/brd_single.docx
@@ -3,1873 +3,2219 @@
 <w:document xmlns:wpc="http://schemas.microsoft.com/office/word/2010/wordprocessingCanvas" xmlns:mo="http://schemas.microsoft.com/office/mac/office/2008/main" xmlns:mc="http://schemas.openxmlformats.org/markup-compatibility/2006" xmlns:mv="urn:schemas-microsoft-com:mac:vml" xmlns:o="urn:schemas-microsoft-com:office:office" xmlns:r="http://schemas.openxmlformats.org/officeDocument/2006/relationships" xmlns:m="http://schemas.openxmlformats.org/officeDocument/2006/math" xmlns:v="urn:schemas-microsoft-com:vml" xmlns:wp14="http://schemas.microsoft.com/office/word/2010/wordprocessingDrawing" xmlns:wp="http://schemas.openxmlformats.org/drawingml/2006/wordprocessingDrawing" xmlns:w10="urn:schemas-microsoft-com:office:word" xmlns:w="http://schemas.openxmlformats.org/wordprocessingml/2006/main" xmlns:w14="http://schemas.microsoft.com/office/word/2010/wordml" xmlns:wpg="http://schemas.microsoft.com/office/word/2010/wordprocessingGroup" xmlns:wpi="http://schemas.microsoft.com/office/word/2010/wordprocessingInk" xmlns:wne="http://schemas.microsoft.com/office/word/2006/wordml" xmlns:wps="http://schemas.microsoft.com/office/word/2010/wordprocessingShape" mc:Ignorable="w14 wp14">
   <w:body>
     <w:p>
+      <w:pPr>
+        <w:pStyle w:val="Heading1"/>
+      </w:pPr>
       <w:r>
-        <w:t>[Header Information]</w:t>
+        <w:t>Business Requirements Document (BRD) — R&amp;D Sensory UX Data Platform Phase 2 Enhancements</w:t>
       </w:r>
     </w:p>
     <w:p>
+      <w:pPr>
+        <w:pStyle w:val="Heading1"/>
+      </w:pPr>
       <w:r>
-        <w:t>Project Name: R&amp;D Sensory UX &amp; Analytical Data App (Stakeholder Portal + Vendor Portal + Transformation Module)</w:t>
+        <w:t># 0. Header Information</w:t>
+      </w:r>
+    </w:p>
+    <w:tbl>
+      <w:tblPr>
+        <w:tblStyle w:val="TableGrid"/>
+        <w:tblW w:type="auto" w:w="0"/>
+        <w:tblLook w:firstColumn="1" w:firstRow="1" w:lastColumn="0" w:lastRow="0" w:noHBand="0" w:noVBand="1" w:val="04A0"/>
+      </w:tblPr>
+      <w:tblGrid>
+        <w:gridCol w:w="4320"/>
+        <w:gridCol w:w="4320"/>
+      </w:tblGrid>
+      <w:tr>
+        <w:tc>
+          <w:tcPr>
+            <w:tcW w:type="dxa" w:w="4320"/>
+          </w:tcPr>
+          <w:p>
+            <w:r>
+              <w:t>Field</w:t>
+            </w:r>
+          </w:p>
+        </w:tc>
+        <w:tc>
+          <w:tcPr>
+            <w:tcW w:type="dxa" w:w="4320"/>
+          </w:tcPr>
+          <w:p>
+            <w:r>
+              <w:t>Value</w:t>
+            </w:r>
+          </w:p>
+        </w:tc>
+      </w:tr>
+      <w:tr>
+        <w:tc>
+          <w:tcPr>
+            <w:tcW w:type="dxa" w:w="4320"/>
+          </w:tcPr>
+          <w:p>
+            <w:r>
+              <w:t>Project Name</w:t>
+            </w:r>
+          </w:p>
+        </w:tc>
+        <w:tc>
+          <w:tcPr>
+            <w:tcW w:type="dxa" w:w="4320"/>
+          </w:tcPr>
+          <w:p>
+            <w:r>
+              <w:t>R&amp;D Sensory UX Data Platform — Phase 2 Enhancements</w:t>
+            </w:r>
+          </w:p>
+        </w:tc>
+      </w:tr>
+      <w:tr>
+        <w:tc>
+          <w:tcPr>
+            <w:tcW w:type="dxa" w:w="4320"/>
+          </w:tcPr>
+          <w:p>
+            <w:r>
+              <w:t>Date</w:t>
+            </w:r>
+          </w:p>
+        </w:tc>
+        <w:tc>
+          <w:tcPr>
+            <w:tcW w:type="dxa" w:w="4320"/>
+          </w:tcPr>
+          <w:p>
+            <w:r>
+              <w:t>2025-05-30</w:t>
+            </w:r>
+          </w:p>
+        </w:tc>
+      </w:tr>
+      <w:tr>
+        <w:tc>
+          <w:tcPr>
+            <w:tcW w:type="dxa" w:w="4320"/>
+          </w:tcPr>
+          <w:p>
+            <w:r>
+              <w:t>Status</w:t>
+            </w:r>
+          </w:p>
+        </w:tc>
+        <w:tc>
+          <w:tcPr>
+            <w:tcW w:type="dxa" w:w="4320"/>
+          </w:tcPr>
+          <w:p>
+            <w:r>
+              <w:t>Draft</w:t>
+            </w:r>
+          </w:p>
+        </w:tc>
+      </w:tr>
+      <w:tr>
+        <w:tc>
+          <w:tcPr>
+            <w:tcW w:type="dxa" w:w="4320"/>
+          </w:tcPr>
+          <w:p>
+            <w:r>
+              <w:t>Document Owner</w:t>
+            </w:r>
+          </w:p>
+        </w:tc>
+        <w:tc>
+          <w:tcPr>
+            <w:tcW w:type="dxa" w:w="4320"/>
+          </w:tcPr>
+          <w:p>
+            <w:r>
+              <w:t>R&amp;D Sensory UX Data &amp; Analytics (Angela Li, Jenn Soong)</w:t>
+            </w:r>
+          </w:p>
+        </w:tc>
+      </w:tr>
+      <w:tr>
+        <w:tc>
+          <w:tcPr>
+            <w:tcW w:type="dxa" w:w="4320"/>
+          </w:tcPr>
+          <w:p>
+            <w:r>
+              <w:t>Version</w:t>
+            </w:r>
+          </w:p>
+        </w:tc>
+        <w:tc>
+          <w:tcPr>
+            <w:tcW w:type="dxa" w:w="4320"/>
+          </w:tcPr>
+          <w:p>
+            <w:r>
+              <w:t>0.1</w:t>
+            </w:r>
+          </w:p>
+        </w:tc>
+      </w:tr>
+    </w:tbl>
+    <w:p>
+      <w:pPr>
+        <w:pStyle w:val="Heading1"/>
+      </w:pPr>
+      <w:r>
+        <w:t># 1. Executive Summary</w:t>
       </w:r>
     </w:p>
     <w:p>
+      <w:pPr>
+        <w:pStyle w:val="ListBullet"/>
+      </w:pPr>
       <w:r>
-        <w:t>Last Updated: 2026-02-16</w:t>
+        <w:t>Purpose: Enhance the existing Sensory UX data application to improve efficiency, data quality, and user experience for global R&amp;D sensory and analytical workflows.</w:t>
       </w:r>
     </w:p>
     <w:p>
+      <w:pPr>
+        <w:pStyle w:val="ListBullet"/>
+      </w:pPr>
       <w:r>
-        <w:t>Status: Ready-for-Sign-off</w:t>
-      </w:r>
-    </w:p>
-    <w:p/>
-    <w:p>
-      <w:r>
-        <w:t>Project Objectives</w:t>
+        <w:t>What is being built: Phase 2 enhancements to the Power Apps-based Stakeholder and Vendor portals and the data transformation module, plus reporting/search improvements.</w:t>
       </w:r>
     </w:p>
     <w:p>
+      <w:pPr>
+        <w:pStyle w:val="ListBullet"/>
+      </w:pPr>
       <w:r>
-        <w:t>- Systematize sensory user experience and analytical test data to enable efficient, accurate insights and future predictive analytics for product development.</w:t>
+        <w:t>Who benefits: Sensory UX Leads, Line Managers, Sensory Directors, R&amp;D Leads, Analytical Leads, Vendors, and Data Admins.</w:t>
       </w:r>
     </w:p>
     <w:p>
+      <w:pPr>
+        <w:pStyle w:val="ListBullet"/>
+      </w:pPr>
       <w:r>
-        <w:t>- Centralize external sensory (consumer testing and descriptive analysis) and internal analytical instrument measures in a structured database.</w:t>
+        <w:t>Intended outcomes: Faster, more accurate ingestion of vendor data; reduced manual mapping; better UX; collaboration; support for non-product tests; stronger governance (approvals, edits, audit).</w:t>
       </w:r>
     </w:p>
     <w:p>
+      <w:pPr>
+        <w:pStyle w:val="ListBullet"/>
+      </w:pPr>
       <w:r>
-        <w:t>- Reduce cycle time to find and leverage historical data (remediate “transactional-only” histories).</w:t>
+        <w:t>Business impact: Shorter cycle times to insights; improved accuracy and trendability of sensory data; reduced admin burden; foundation for future predictive analytics.</w:t>
       </w:r>
     </w:p>
     <w:p>
+      <w:pPr>
+        <w:pStyle w:val="ListBullet"/>
+      </w:pPr>
       <w:r>
-        <w:t>- Ensure global, vendor-inclusive workflow with role-based access and auditability.</w:t>
+        <w:t>Scope emphasis: Pre-RFP approvals, SIF bulk operations and exports, improved transformation matching, post-completion edits, search/filter/UX upgrades, and guardrails for test completion.</w:t>
       </w:r>
     </w:p>
     <w:p>
+      <w:pPr>
+        <w:pStyle w:val="Heading1"/>
+      </w:pPr>
       <w:r>
-        <w:t>- Transformation Engine objective: reliably ingest heterogeneous vendor raw files, clean, map questions/attributes, and restructure to the database schema for Power BI analytics.</w:t>
+        <w:t># 2. Business Context &amp; Problem Statement</w:t>
       </w:r>
     </w:p>
     <w:p>
+      <w:pPr>
+        <w:pStyle w:val="ListBullet"/>
+      </w:pPr>
       <w:r>
-        <w:t>- Scale target: 50–100 global users in Year 1 across Europe, APAC, North America.</w:t>
+        <w:t>Background / context:</w:t>
       </w:r>
     </w:p>
     <w:p>
+      <w:pPr>
+        <w:pStyle w:val="ListBullet2"/>
+      </w:pPr>
       <w:r>
-        <w:t>- Data volume: 700+ survey questions and 500+ sensory attributes must be manageable in admin UI and reporting.</w:t>
+        <w:t>Custom Power Apps solution with Stakeholder portal, Vendor portal, and a data transformation engine; feeds Power BI from SQL sensory schema.</w:t>
       </w:r>
     </w:p>
     <w:p>
+      <w:pPr>
+        <w:pStyle w:val="ListBullet2"/>
+      </w:pPr>
       <w:r>
-        <w:t>- Current data composition: Sensory UX data represents ~94% of total database content.</w:t>
-      </w:r>
-    </w:p>
-    <w:p/>
-    <w:p>
-      <w:r>
-        <w:t>1. Technology Platform and Tools</w:t>
+        <w:t>Data types: Sensory (consumer tests, descriptive analysis) and Analytical (instrument measures).</w:t>
       </w:r>
     </w:p>
     <w:p>
+      <w:pPr>
+        <w:pStyle w:val="ListBullet2"/>
+      </w:pPr>
       <w:r>
-        <w:t>- Microsoft Power Apps</w:t>
+        <w:t>Files stored in EDP (e.g., SharePoint) with Power Automate notifications; internal users via AAD; vendors via separate credentials.</w:t>
       </w:r>
     </w:p>
     <w:p>
+      <w:pPr>
+        <w:pStyle w:val="ListBullet"/>
+      </w:pPr>
       <w:r>
-        <w:t xml:space="preserve">  - Purpose: Front-end application for Stakeholder Portal (internal users) and Vendor Portal (external users).</w:t>
+        <w:t>Current state:</w:t>
       </w:r>
     </w:p>
     <w:p>
+      <w:pPr>
+        <w:pStyle w:val="ListBullet2"/>
+      </w:pPr>
       <w:r>
-        <w:t xml:space="preserve">  - Functions: Workflow forms (RFP, One-Pager, SIF, Micro Clearance), role-specific dashboards, vendor submissions, approvals.</w:t>
+        <w:t>Go-live ~2025-03-01; ~3 months in production at time of meeting; ~35 tables (19 original sensory + app tables).</w:t>
       </w:r>
     </w:p>
     <w:p>
+      <w:pPr>
+        <w:pStyle w:val="ListBullet2"/>
+      </w:pPr>
       <w:r>
-        <w:t>- Microsoft Power BI</w:t>
+        <w:t>Incident list ~45 items; stabilized from daily incidents to fewer; vendor support (1 Power Apps, 1 Python) focused on incidents.</w:t>
       </w:r>
     </w:p>
     <w:p>
+      <w:pPr>
+        <w:pStyle w:val="ListBullet2"/>
+      </w:pPr>
       <w:r>
-        <w:t xml:space="preserve">  - Purpose: Reporting/analytics layer on finalized sensory schema.</w:t>
+        <w:t>Power BI reports running on sensory schema; R&amp;D schema holds app/holding data prior to completion.</w:t>
       </w:r>
     </w:p>
     <w:p>
+      <w:pPr>
+        <w:pStyle w:val="ListBullet"/>
+      </w:pPr>
       <w:r>
-        <w:t xml:space="preserve">  - Functions: Product/test dashboards (e.g., tests by region, type, product comparisons), data slicing.</w:t>
+        <w:t>Problem / pain points:</w:t>
       </w:r>
     </w:p>
     <w:p>
+      <w:pPr>
+        <w:pStyle w:val="ListBullet2"/>
+      </w:pPr>
       <w:r>
-        <w:t>- Azure SQL Database (Schemas: RND schema, Sensory schema)</w:t>
+        <w:t>UX is clunky (excess scrolling, poor file visibility, limited filters/search).</w:t>
       </w:r>
     </w:p>
     <w:p>
+      <w:pPr>
+        <w:pStyle w:val="ListBullet2"/>
+      </w:pPr>
       <w:r>
-        <w:t xml:space="preserve">  - Purpose: System of record.</w:t>
+        <w:t>Data transformation matching accuracy lower than expected (worst observed ~65%); supervised learning not improving matching over time.</w:t>
       </w:r>
     </w:p>
     <w:p>
+      <w:pPr>
+        <w:pStyle w:val="ListBullet2"/>
+      </w:pPr>
       <w:r>
-        <w:t xml:space="preserve">  - RND schema: App-facing “holding”/staging and functional tables (dropdowns, notifications, approvals, holding tables pre-completion).</w:t>
+        <w:t>Post-completion edits do not propagate to sensory schema/BI; SIF cannot be bulk-populated or exported.</w:t>
       </w:r>
     </w:p>
     <w:p>
+      <w:pPr>
+        <w:pStyle w:val="ListBullet2"/>
+      </w:pPr>
       <w:r>
-        <w:t xml:space="preserve">  - Sensory schema: Finalized data for reporting; receives data post-completion through controlled push from the app/transformation.</w:t>
+        <w:t>Workflow rigidity (cannot easily handle non-product tests; single editor on active tests; dropdowns not category-filtered).</w:t>
       </w:r>
     </w:p>
     <w:p>
+      <w:pPr>
+        <w:pStyle w:val="ListBullet2"/>
+      </w:pPr>
       <w:r>
-        <w:t xml:space="preserve">  - Current footprint: ~35 total tables (19 original sensory tables; additional app/RND tables added during development).</w:t>
+        <w:t>Limited observability/performance/security testing visibility; provisioning requires platform team; vendor licenses are required.</w:t>
       </w:r>
     </w:p>
     <w:p>
+      <w:pPr>
+        <w:pStyle w:val="ListBullet"/>
+      </w:pPr>
       <w:r>
-        <w:t>- Python (Pandas)</w:t>
+        <w:t>Why now / business drivers:</w:t>
       </w:r>
     </w:p>
     <w:p>
+      <w:pPr>
+        <w:pStyle w:val="ListBullet2"/>
+      </w:pPr>
       <w:r>
-        <w:t xml:space="preserve">  - Purpose: Data Transformation Engine (intermediate and output files), question mapping, scoring, wide-to-long reshaping, code legend generation.</w:t>
+        <w:t>Accelerate accurate, trendable insights; reduce manual overhead; expand use cases (non-product research); enable future predictive analytics; improve stakeholder experience and governance.</w:t>
       </w:r>
     </w:p>
     <w:p>
+      <w:pPr>
+        <w:pStyle w:val="Heading1"/>
+      </w:pPr>
       <w:r>
-        <w:t xml:space="preserve">  - Maintained by: Python engineer (Rahul).</w:t>
+        <w:t># 3. Objectives &amp; Success Metrics</w:t>
       </w:r>
     </w:p>
     <w:p>
+      <w:pPr>
+        <w:pStyle w:val="ListBullet"/>
+      </w:pPr>
       <w:r>
-        <w:t>- Azure Active Directory (Internal users)</w:t>
+        <w:t>Objectives:</w:t>
       </w:r>
     </w:p>
     <w:p>
+      <w:pPr>
+        <w:pStyle w:val="ListBullet2"/>
+      </w:pPr>
       <w:r>
-        <w:t xml:space="preserve">  - Purpose: Internal user authentication/authorization. Internal users added via AD with approvals from platform team.</w:t>
+        <w:t>Increase matching accuracy and reduce manual effort in the data transformation process.</w:t>
       </w:r>
     </w:p>
     <w:p>
+      <w:pPr>
+        <w:pStyle w:val="ListBullet2"/>
+      </w:pPr>
       <w:r>
-        <w:t>- External User Access/Licensing</w:t>
+        <w:t>Improve UX: navigation, visibility of uploads, filters/search, dropdown relevance, bulk SIF operations.</w:t>
       </w:r>
     </w:p>
     <w:p>
+      <w:pPr>
+        <w:pStyle w:val="ListBullet2"/>
+      </w:pPr>
       <w:r>
-        <w:t xml:space="preserve">  - Purpose: Vendor access via separate, email-based IDs; licensing managed by Platform Team (Kaushal).</w:t>
+        <w:t>Introduce pre-RFP approvals and ensure vendor-facing updates reflect approved changes.</w:t>
       </w:r>
     </w:p>
     <w:p>
+      <w:pPr>
+        <w:pStyle w:val="ListBullet2"/>
+      </w:pPr>
       <w:r>
-        <w:t>- Email Notifications</w:t>
+        <w:t>Allow post-completion data edits to flow through to the sensory schema and Power BI.</w:t>
       </w:r>
     </w:p>
     <w:p>
+      <w:pPr>
+        <w:pStyle w:val="ListBullet2"/>
+      </w:pPr>
       <w:r>
-        <w:t xml:space="preserve">  - Purpose: Workflow alerts (e.g., vendor submission, approvals). Current implementation sends emails when vendors submit and at key workflow steps.</w:t>
-      </w:r>
-    </w:p>
-    <w:p/>
-    <w:p>
-      <w:r>
-        <w:t>2. User Roles/Responsibilities</w:t>
+        <w:t>Support non-product tests and multi-editor collaboration.</w:t>
       </w:r>
     </w:p>
     <w:p>
+      <w:pPr>
+        <w:pStyle w:val="ListBullet2"/>
+      </w:pPr>
       <w:r>
-        <w:t>Role/Title | Responsibilities | Dashboard/View | Comments</w:t>
+        <w:t>Establish guardrails for test conclusion and strengthen data quality validation and auditability.</w:t>
       </w:r>
     </w:p>
     <w:p>
+      <w:pPr>
+        <w:pStyle w:val="ListBullet"/>
+      </w:pPr>
       <w:r>
-        <w:t>- Data Admin (e.g., Angela Li, Jenn Soong) | Full lifecycle oversight; manage users/vendors; manage dropdowns; manage category mapping for transformation; run intermediate/output file steps; coordinate push to sensory schema; bypass approvals when needed; incident triage | View/Edit ALL tests (active and completed); Admin menus (vendors, users, dropdowns, bypass, category mapping); All dashboards | Currently cannot edit finalized data in sensory schema post-completion; requested in Phase 2.</w:t>
+        <w:t>Success metrics / KPIs (directional):</w:t>
       </w:r>
     </w:p>
     <w:p>
+      <w:pPr>
+        <w:pStyle w:val="ListBullet2"/>
+      </w:pPr>
       <w:r>
-        <w:t>- Sensory UX Lead | Create RFP; compile One-Pager; select vendor; submit for approval; sign off vendor acceptance; route SIF to R&amp;D Lead; send SIF to vendor; receive and QC vendor files; compile McCain report; submit report for approval; conclude test | Own Active Tests; Completed Tests (read-only); notifications on vendor submissions | Receives email when vendor submits; can only work tests assigned to them; currently only one active editor per test (Phase 2: allow multi-editor).</w:t>
+        <w:t>Reduction in time spent on manual question/attribute mapping per study.</w:t>
       </w:r>
     </w:p>
     <w:p>
+      <w:pPr>
+        <w:pStyle w:val="ListBullet2"/>
+      </w:pPr>
       <w:r>
-        <w:t>- Line Manager | Approve/return One-Pager/proposal with comments; optionally create RFP (current capability) | Own dashboard with tests awaiting approval | Phase 2 ask: allow completing entire test workflow when they oversee testing (parity with Sensory Lead).</w:t>
+        <w:t>Increase in transformation match accuracy vs. current baseline.</w:t>
       </w:r>
     </w:p>
     <w:p>
+      <w:pPr>
+        <w:pStyle w:val="ListBullet2"/>
+      </w:pPr>
       <w:r>
-        <w:t>- Sensory Director | Approve/return One-Pager/proposal with comments | Own dashboard with tests awaiting approval | Approval authority at proposal/One-Pager and final report stages.</w:t>
+        <w:t>Decrease in incident count related to UX and data quality issues.</w:t>
       </w:r>
     </w:p>
     <w:p>
+      <w:pPr>
+        <w:pStyle w:val="ListBullet2"/>
+      </w:pPr>
       <w:r>
-        <w:t>- R&amp;D Lead | Complete Sample Information Form (SIF): product info, cooking instructions, holding/delivery protocols; complete Micro Clearance acknowledgement | Own tasks (SIF, Micro Clearance) | Sends SIF back to Sensory Lead; vendor sees SIF read-only and adds codes/equipment.</w:t>
+        <w:t>User adoption/usage across 50–100 global users within first year (as estimated).</w:t>
       </w:r>
     </w:p>
     <w:p>
+      <w:pPr>
+        <w:pStyle w:val="ListBullet"/>
+      </w:pPr>
       <w:r>
-        <w:t>- Analytical Lead | Create analytical tests; plan sample info; upload analytical data; no approvals | Own Active/Completed Analytical Tests | Simplified workflow vs Sensory UX.</w:t>
+        <w:t>Baseline (if stated):</w:t>
       </w:r>
     </w:p>
     <w:p>
+      <w:pPr>
+        <w:pStyle w:val="ListBullet2"/>
+      </w:pPr>
       <w:r>
-        <w:t>- Vendor (External) | View RFP details; submit proposals; view SIF; enter sample blinding codes and equipment; upload raw data/reports | Vendor Portal with limited views; Upload sections; Notifications to Sensory Lead | Auth via separate email-based IDs; license required per vendor user.</w:t>
+        <w:t>Worst-case transformation matching observed ~65%; ~45 incidents tracked since go-live.</w:t>
       </w:r>
     </w:p>
     <w:p>
+      <w:pPr>
+        <w:pStyle w:val="ListBullet"/>
+      </w:pPr>
       <w:r>
-        <w:t>- Platform Admin (Kaushal team) | Provision licenses; grant external/internal access | N/A | Gatekeeper for external vendor licensing and internal user access enablement (email-driven).</w:t>
+        <w:t>Measurement cadence &amp; owners (if stated):</w:t>
       </w:r>
     </w:p>
     <w:p>
+      <w:pPr>
+        <w:pStyle w:val="ListBullet2"/>
+      </w:pPr>
       <w:r>
-        <w:t>- Support (Blackstraw) | Power Apps dev (Azure) for incidents; Python (Rahul) for transformation incidents | N/A | Incident-only remit per current contract; change requests deferred to Phase 2.</w:t>
-      </w:r>
-    </w:p>
-    <w:p/>
-    <w:p>
-      <w:r>
-        <w:t>3. Workflow Phases (Functional Requirements)</w:t>
-      </w:r>
-    </w:p>
-    <w:p/>
-    <w:p>
-      <w:r>
-        <w:t>Workflow 1: Sensory UX (External + Internal)</w:t>
+        <w:t>Not specified; Data Admins currently track incidents and usage indicators through active/completed tests.</w:t>
       </w:r>
     </w:p>
     <w:p>
+      <w:pPr>
+        <w:pStyle w:val="Heading1"/>
+      </w:pPr>
       <w:r>
-        <w:t>Phase 1.1: Login &amp; Role-Based Dashboard</w:t>
+        <w:t># 4. Scope</w:t>
       </w:r>
     </w:p>
     <w:p>
+      <w:pPr>
+        <w:pStyle w:val="Heading2"/>
+      </w:pPr>
       <w:r>
-        <w:t>- ID: Req 1.1.1</w:t>
+        <w:t>## 4.1 In Scope</w:t>
       </w:r>
     </w:p>
     <w:p>
+      <w:pPr>
+        <w:pStyle w:val="ListBullet"/>
+      </w:pPr>
       <w:r>
-        <w:t>- Description: Users authenticate and land on role-specific dashboard (Active Tests, Completed Tests, Approvals).</w:t>
+        <w:t>Pre-RFP one-pager approvals (LM/SD) with change propagation to vendor RFP and notifications.</w:t>
       </w:r>
     </w:p>
     <w:p>
+      <w:pPr>
+        <w:pStyle w:val="ListBullet"/>
+      </w:pPr>
       <w:r>
-        <w:t>- Business Rule/Logic:</w:t>
+        <w:t>Data Admin post-completion edits that propagate to sensory schema and Power BI, with audit.</w:t>
       </w:r>
     </w:p>
     <w:p>
+      <w:pPr>
+        <w:pStyle w:val="ListBullet"/>
+      </w:pPr>
       <w:r>
-        <w:t xml:space="preserve">  - IF Role = Data Admin THEN show Admin menus (Vendors, Users, Dropdowns, Bypass approvals, Category Mapping, Table views).</w:t>
+        <w:t>Improved data transformation matching workflow and tools (verification UI, flags, admin actions).</w:t>
       </w:r>
     </w:p>
     <w:p>
+      <w:pPr>
+        <w:pStyle w:val="ListBullet"/>
+      </w:pPr>
       <w:r>
-        <w:t xml:space="preserve">  - IF Role = Sensory Lead THEN show Active Tests assigned; Completed Tests (read-only); vendor submission notifications.</w:t>
+        <w:t>UX upgrades: minimize scrolling, visible file upload status, improved search/filter, category-filtered dropdowns.</w:t>
       </w:r>
     </w:p>
     <w:p>
+      <w:pPr>
+        <w:pStyle w:val="ListBullet"/>
+      </w:pPr>
       <w:r>
-        <w:t>- UI/UX Requirement:</w:t>
+        <w:t>SIF bulk operations (copy/paste or import) and export (Excel/PDF).</w:t>
       </w:r>
     </w:p>
     <w:p>
+      <w:pPr>
+        <w:pStyle w:val="ListBullet"/>
+      </w:pPr>
       <w:r>
-        <w:t xml:space="preserve">  - Status badges for each test phase (proposal pending, approval pending, SIF pending, vendor upload pending, report approval pending, completed).</w:t>
+        <w:t>Non-product test accommodation (skip SIF without breaking workflow).</w:t>
       </w:r>
     </w:p>
     <w:p>
+      <w:pPr>
+        <w:pStyle w:val="ListBullet"/>
+      </w:pPr>
       <w:r>
-        <w:t xml:space="preserve">  - Minimal horizontal scrolling; responsive grid layouts.</w:t>
-      </w:r>
-    </w:p>
-    <w:p/>
-    <w:p>
-      <w:r>
-        <w:t>Phase 1.2: Pre-Approval (New) Before RFP Submission to Vendors</w:t>
+        <w:t>Multi-editor support on active tests; enable LM to complete full workflow when required.</w:t>
       </w:r>
     </w:p>
     <w:p>
+      <w:pPr>
+        <w:pStyle w:val="ListBullet"/>
+      </w:pPr>
       <w:r>
-        <w:t>- ID: Req 1.2.1</w:t>
+        <w:t>One-pager and report template generation (PPT) from entered fields.</w:t>
       </w:r>
     </w:p>
     <w:p>
+      <w:pPr>
+        <w:pStyle w:val="ListBullet"/>
+      </w:pPr>
       <w:r>
-        <w:t>- Description: Introduce a pre-approval One-Pager step by Line Manager and Sensory Director before issuing the RFP to vendors.</w:t>
+        <w:t>Test completion guard (block or explicit override until transformation complete).</w:t>
       </w:r>
     </w:p>
     <w:p>
+      <w:pPr>
+        <w:pStyle w:val="ListBullet"/>
+      </w:pPr>
       <w:r>
-        <w:t>- Logic:</w:t>
+        <w:t>Data quality validations and standardization (e.g., NA/blank handling, de-duplication).</w:t>
       </w:r>
     </w:p>
     <w:p>
+      <w:pPr>
+        <w:pStyle w:val="ListBullet"/>
+      </w:pPr>
       <w:r>
-        <w:t xml:space="preserve">  - IF One-Pager (background/objectives/products/plan) approved by both roles THEN enable RFP dispatch.</w:t>
+        <w:t>Study Name automation based on Project Number; new Study requests with admin approval.</w:t>
       </w:r>
     </w:p>
     <w:p>
+      <w:pPr>
+        <w:pStyle w:val="ListBullet"/>
+      </w:pPr>
       <w:r>
-        <w:t xml:space="preserve">  - IF One-Pager returned with comments THEN Sensory Lead must update and resubmit; version history maintained.</w:t>
+        <w:t>Admin UI for dropdown/holding protocol list management.</w:t>
       </w:r>
     </w:p>
     <w:p>
+      <w:pPr>
+        <w:pStyle w:val="ListBullet"/>
+      </w:pPr>
       <w:r>
-        <w:t xml:space="preserve">  - IF updates post-approval change any field that impacts RFP scope (e.g., objectives, products) THEN invalidate previously sent RFPs and notify impacted vendors; require vendor re-acknowledgment.</w:t>
+        <w:t>Operational improvements: notifications, admin bypass logging, provisioning request tracking.</w:t>
       </w:r>
     </w:p>
     <w:p>
+      <w:pPr>
+        <w:pStyle w:val="ListBullet"/>
+      </w:pPr>
       <w:r>
-        <w:t>- UI/UX Requirement:</w:t>
+        <w:t>Non-functional: introduce observability/monitoring and perform security/performance testing where feasible.</w:t>
       </w:r>
     </w:p>
     <w:p>
+      <w:pPr>
+        <w:pStyle w:val="Heading2"/>
+      </w:pPr>
       <w:r>
-        <w:t xml:space="preserve">  - “Download One-Pager” as PPT export (Phase 2 feature) with mapped fields.</w:t>
+        <w:t>## 4.2 Out of Scope</w:t>
       </w:r>
     </w:p>
     <w:p>
+      <w:pPr>
+        <w:pStyle w:val="ListBullet"/>
+      </w:pPr>
       <w:r>
-        <w:t xml:space="preserve">  - Visual indicator when any One-Pager field differs from the last vendor-notified version.</w:t>
-      </w:r>
-    </w:p>
-    <w:p/>
-    <w:p>
-      <w:r>
-        <w:t>Phase 1.3: RFP Creation and Dispatch</w:t>
+        <w:t>Predictive analytics or formulation prediction capabilities.</w:t>
       </w:r>
     </w:p>
     <w:p>
+      <w:pPr>
+        <w:pStyle w:val="ListBullet"/>
+      </w:pPr>
       <w:r>
-        <w:t>- ID: Req 1.3.1</w:t>
+        <w:t>Integration with SAP/Coupa vendor master and PO systems (targeted for later phase).</w:t>
       </w:r>
     </w:p>
     <w:p>
+      <w:pPr>
+        <w:pStyle w:val="ListBullet"/>
+      </w:pPr>
       <w:r>
-        <w:t>- Description: Sensory Lead creates RFP with project background, objectives, products, test type (consumer vs descriptive), region, category, etc.</w:t>
+        <w:t>Integration with external ingredient/spec platforms (e.g., TraceGains) for supplier data maintenance.</w:t>
       </w:r>
     </w:p>
     <w:p>
+      <w:pPr>
+        <w:pStyle w:val="ListBullet"/>
+      </w:pPr>
       <w:r>
-        <w:t>- Logic:</w:t>
+        <w:t>Major re-platforming or replacing Power Apps/EDP/SQL/Power BI stack.</w:t>
       </w:r>
     </w:p>
     <w:p>
+      <w:pPr>
+        <w:pStyle w:val="Heading2"/>
+      </w:pPr>
       <w:r>
-        <w:t xml:space="preserve">  - IF Pre-Approval status != Approved THEN RFP Dispatch = Disabled.</w:t>
+        <w:t>## 4.3 Constraints (only what is stated)</w:t>
       </w:r>
     </w:p>
     <w:p>
+      <w:pPr>
+        <w:pStyle w:val="ListBullet"/>
+      </w:pPr>
       <w:r>
-        <w:t xml:space="preserve">  - Multi-vendor support: allow selection of one or more vendors for solicitation.</w:t>
+        <w:t>Power Apps UX limitations cited by prior vendor; timelines previously tight.</w:t>
       </w:r>
     </w:p>
     <w:p>
+      <w:pPr>
+        <w:pStyle w:val="ListBullet"/>
+      </w:pPr>
       <w:r>
-        <w:t>- UI/UX Requirement:</w:t>
+        <w:t>External vendor licenses required; internal user provisioning via platform team.</w:t>
       </w:r>
     </w:p>
     <w:p>
+      <w:pPr>
+        <w:pStyle w:val="ListBullet"/>
+      </w:pPr>
       <w:r>
-        <w:t xml:space="preserve">  - Multi-select vendor picker; summary of dispatched vendors; audit trail.</w:t>
-      </w:r>
-    </w:p>
-    <w:p/>
-    <w:p>
-      <w:r>
-        <w:t>Phase 1.4: Vendor Proposal Submission</w:t>
+        <w:t>Current support model limited to incident response (one Power Apps, one Python resource).</w:t>
       </w:r>
     </w:p>
     <w:p>
+      <w:pPr>
+        <w:pStyle w:val="ListBullet"/>
+      </w:pPr>
       <w:r>
-        <w:t>- ID: Req 1.4.1</w:t>
+        <w:t>Vendor data formats vary; full standardization not feasible across all agencies.</w:t>
       </w:r>
     </w:p>
     <w:p>
+      <w:pPr>
+        <w:pStyle w:val="Heading1"/>
+      </w:pPr>
       <w:r>
-        <w:t>- Description: Vendors submit proposals in Vendor Portal; can upload proposal docs and cost estimates.</w:t>
+        <w:t># 5. Stakeholders &amp; Roles</w:t>
+      </w:r>
+    </w:p>
+    <w:tbl>
+      <w:tblPr>
+        <w:tblStyle w:val="TableGrid"/>
+        <w:tblW w:type="auto" w:w="0"/>
+        <w:tblLook w:firstColumn="1" w:firstRow="1" w:lastColumn="0" w:lastRow="0" w:noHBand="0" w:noVBand="1" w:val="04A0"/>
+      </w:tblPr>
+      <w:tblGrid>
+        <w:gridCol w:w="2160"/>
+        <w:gridCol w:w="2160"/>
+        <w:gridCol w:w="2160"/>
+        <w:gridCol w:w="2160"/>
+      </w:tblGrid>
+      <w:tr>
+        <w:tc>
+          <w:tcPr>
+            <w:tcW w:type="dxa" w:w="2160"/>
+          </w:tcPr>
+          <w:p>
+            <w:r>
+              <w:t>Role/Group</w:t>
+            </w:r>
+          </w:p>
+        </w:tc>
+        <w:tc>
+          <w:tcPr>
+            <w:tcW w:type="dxa" w:w="2160"/>
+          </w:tcPr>
+          <w:p>
+            <w:r>
+              <w:t>Responsibilities</w:t>
+            </w:r>
+          </w:p>
+        </w:tc>
+        <w:tc>
+          <w:tcPr>
+            <w:tcW w:type="dxa" w:w="2160"/>
+          </w:tcPr>
+          <w:p>
+            <w:r>
+              <w:t>Access/View (if stated)</w:t>
+            </w:r>
+          </w:p>
+        </w:tc>
+        <w:tc>
+          <w:tcPr>
+            <w:tcW w:type="dxa" w:w="2160"/>
+          </w:tcPr>
+          <w:p>
+            <w:r>
+              <w:t>Notes</w:t>
+            </w:r>
+          </w:p>
+        </w:tc>
+      </w:tr>
+      <w:tr>
+        <w:tc>
+          <w:tcPr>
+            <w:tcW w:type="dxa" w:w="2160"/>
+          </w:tcPr>
+          <w:p>
+            <w:r>
+              <w:t>Sensory UX Lead</w:t>
+            </w:r>
+          </w:p>
+        </w:tc>
+        <w:tc>
+          <w:tcPr>
+            <w:tcW w:type="dxa" w:w="2160"/>
+          </w:tcPr>
+          <w:p>
+            <w:r>
+              <w:t>Owns RFPs, 1-pagers, test setup, coordinates vendor, creates McCain Sensory Report, submits for approvals, concludes tests</w:t>
+            </w:r>
+          </w:p>
+        </w:tc>
+        <w:tc>
+          <w:tcPr>
+            <w:tcW w:type="dxa" w:w="2160"/>
+          </w:tcPr>
+          <w:p>
+            <w:r>
+              <w:t>Dashboard; create/edit tests; view/download files; send/receive notifications</w:t>
+            </w:r>
+          </w:p>
+        </w:tc>
+        <w:tc>
+          <w:tcPr>
+            <w:tcW w:type="dxa" w:w="2160"/>
+          </w:tcPr>
+          <w:p>
+            <w:r/>
+          </w:p>
+        </w:tc>
+      </w:tr>
+      <w:tr>
+        <w:tc>
+          <w:tcPr>
+            <w:tcW w:type="dxa" w:w="2160"/>
+          </w:tcPr>
+          <w:p>
+            <w:r>
+              <w:t>Line Manager (LM)</w:t>
+            </w:r>
+          </w:p>
+        </w:tc>
+        <w:tc>
+          <w:tcPr>
+            <w:tcW w:type="dxa" w:w="2160"/>
+          </w:tcPr>
+          <w:p>
+            <w:r>
+              <w:t>Approves 1-pagers and final reports; can initiate workflows; comments/returns</w:t>
+            </w:r>
+          </w:p>
+        </w:tc>
+        <w:tc>
+          <w:tcPr>
+            <w:tcW w:type="dxa" w:w="2160"/>
+          </w:tcPr>
+          <w:p>
+            <w:r>
+              <w:t>Dashboard; approvals; (Phase 2) complete full workflow if overseeing test</w:t>
+            </w:r>
+          </w:p>
+        </w:tc>
+        <w:tc>
+          <w:tcPr>
+            <w:tcW w:type="dxa" w:w="2160"/>
+          </w:tcPr>
+          <w:p>
+            <w:r/>
+          </w:p>
+        </w:tc>
+      </w:tr>
+      <w:tr>
+        <w:tc>
+          <w:tcPr>
+            <w:tcW w:type="dxa" w:w="2160"/>
+          </w:tcPr>
+          <w:p>
+            <w:r>
+              <w:t>Sensory Director (SD)</w:t>
+            </w:r>
+          </w:p>
+        </w:tc>
+        <w:tc>
+          <w:tcPr>
+            <w:tcW w:type="dxa" w:w="2160"/>
+          </w:tcPr>
+          <w:p>
+            <w:r>
+              <w:t>Approves 1-pagers and final reports; comments/returns</w:t>
+            </w:r>
+          </w:p>
+        </w:tc>
+        <w:tc>
+          <w:tcPr>
+            <w:tcW w:type="dxa" w:w="2160"/>
+          </w:tcPr>
+          <w:p>
+            <w:r>
+              <w:t>Dashboard; approvals</w:t>
+            </w:r>
+          </w:p>
+        </w:tc>
+        <w:tc>
+          <w:tcPr>
+            <w:tcW w:type="dxa" w:w="2160"/>
+          </w:tcPr>
+          <w:p>
+            <w:r/>
+          </w:p>
+        </w:tc>
+      </w:tr>
+      <w:tr>
+        <w:tc>
+          <w:tcPr>
+            <w:tcW w:type="dxa" w:w="2160"/>
+          </w:tcPr>
+          <w:p>
+            <w:r>
+              <w:t>R&amp;D Lead</w:t>
+            </w:r>
+          </w:p>
+        </w:tc>
+        <w:tc>
+          <w:tcPr>
+            <w:tcW w:type="dxa" w:w="2160"/>
+          </w:tcPr>
+          <w:p>
+            <w:r>
+              <w:t>Completes SIF; micro clearance acknowledgement; provides sample prep details</w:t>
+            </w:r>
+          </w:p>
+        </w:tc>
+        <w:tc>
+          <w:tcPr>
+            <w:tcW w:type="dxa" w:w="2160"/>
+          </w:tcPr>
+          <w:p>
+            <w:r>
+              <w:t>SIF &amp; Micro Clearance forms; linked by TestID</w:t>
+            </w:r>
+          </w:p>
+        </w:tc>
+        <w:tc>
+          <w:tcPr>
+            <w:tcW w:type="dxa" w:w="2160"/>
+          </w:tcPr>
+          <w:p>
+            <w:r/>
+          </w:p>
+        </w:tc>
+      </w:tr>
+      <w:tr>
+        <w:tc>
+          <w:tcPr>
+            <w:tcW w:type="dxa" w:w="2160"/>
+          </w:tcPr>
+          <w:p>
+            <w:r>
+              <w:t>Analytical Lead</w:t>
+            </w:r>
+          </w:p>
+        </w:tc>
+        <w:tc>
+          <w:tcPr>
+            <w:tcW w:type="dxa" w:w="2160"/>
+          </w:tcPr>
+          <w:p>
+            <w:r>
+              <w:t>Creates and completes analytical tests; uploads analytical data; coordinates with Data Admin</w:t>
+            </w:r>
+          </w:p>
+        </w:tc>
+        <w:tc>
+          <w:tcPr>
+            <w:tcW w:type="dxa" w:w="2160"/>
+          </w:tcPr>
+          <w:p>
+            <w:r>
+              <w:t>Analytical workflow dashboard; upload/download</w:t>
+            </w:r>
+          </w:p>
+        </w:tc>
+        <w:tc>
+          <w:tcPr>
+            <w:tcW w:type="dxa" w:w="2160"/>
+          </w:tcPr>
+          <w:p>
+            <w:r/>
+          </w:p>
+        </w:tc>
+      </w:tr>
+      <w:tr>
+        <w:tc>
+          <w:tcPr>
+            <w:tcW w:type="dxa" w:w="2160"/>
+          </w:tcPr>
+          <w:p>
+            <w:r>
+              <w:t>Vendor (External)</w:t>
+            </w:r>
+          </w:p>
+        </w:tc>
+        <w:tc>
+          <w:tcPr>
+            <w:tcW w:type="dxa" w:w="2160"/>
+          </w:tcPr>
+          <w:p>
+            <w:r>
+              <w:t>Receives RFP; submits proposals; completes SIF sections (codes/equipment/packaging); uploads raw data &amp; reports</w:t>
+            </w:r>
+          </w:p>
+        </w:tc>
+        <w:tc>
+          <w:tcPr>
+            <w:tcW w:type="dxa" w:w="2160"/>
+          </w:tcPr>
+          <w:p>
+            <w:r>
+              <w:t>Vendor portal with limited access; upload and view-only relevant details</w:t>
+            </w:r>
+          </w:p>
+        </w:tc>
+        <w:tc>
+          <w:tcPr>
+            <w:tcW w:type="dxa" w:w="2160"/>
+          </w:tcPr>
+          <w:p>
+            <w:r>
+              <w:t>Authenticated via separate vendor credentials; licensed</w:t>
+            </w:r>
+          </w:p>
+        </w:tc>
+      </w:tr>
+      <w:tr>
+        <w:tc>
+          <w:tcPr>
+            <w:tcW w:type="dxa" w:w="2160"/>
+          </w:tcPr>
+          <w:p>
+            <w:r>
+              <w:t>Data Admin (e.g., Angela Li, Jenn Soong)</w:t>
+            </w:r>
+          </w:p>
+        </w:tc>
+        <w:tc>
+          <w:tcPr>
+            <w:tcW w:type="dxa" w:w="2160"/>
+          </w:tcPr>
+          <w:p>
+            <w:r>
+              <w:t>Manage data transformation; verify mappings; manage dropdowns/reference lists; add vendors/users; oversee incidents; admin bypass</w:t>
+            </w:r>
+          </w:p>
+        </w:tc>
+        <w:tc>
+          <w:tcPr>
+            <w:tcW w:type="dxa" w:w="2160"/>
+          </w:tcPr>
+          <w:p>
+            <w:r>
+              <w:t>Admin dashboard; manage transformation engine; manage vendors; manage dropdowns; view/edit tests</w:t>
+            </w:r>
+          </w:p>
+        </w:tc>
+        <w:tc>
+          <w:tcPr>
+            <w:tcW w:type="dxa" w:w="2160"/>
+          </w:tcPr>
+          <w:p>
+            <w:r/>
+          </w:p>
+        </w:tc>
+      </w:tr>
+      <w:tr>
+        <w:tc>
+          <w:tcPr>
+            <w:tcW w:type="dxa" w:w="2160"/>
+          </w:tcPr>
+          <w:p>
+            <w:r>
+              <w:t>Platform/IT (e.g., Kaushal/Koushal team)</w:t>
+            </w:r>
+          </w:p>
+        </w:tc>
+        <w:tc>
+          <w:tcPr>
+            <w:tcW w:type="dxa" w:w="2160"/>
+          </w:tcPr>
+          <w:p>
+            <w:r>
+              <w:t>Provision internal users; manage external vendor licenses; AAD integration; platform access</w:t>
+            </w:r>
+          </w:p>
+        </w:tc>
+        <w:tc>
+          <w:tcPr>
+            <w:tcW w:type="dxa" w:w="2160"/>
+          </w:tcPr>
+          <w:p>
+            <w:r>
+              <w:t>Backend/platform controls</w:t>
+            </w:r>
+          </w:p>
+        </w:tc>
+        <w:tc>
+          <w:tcPr>
+            <w:tcW w:type="dxa" w:w="2160"/>
+          </w:tcPr>
+          <w:p>
+            <w:r/>
+          </w:p>
+        </w:tc>
+      </w:tr>
+    </w:tbl>
+    <w:p>
+      <w:pPr>
+        <w:pStyle w:val="Heading1"/>
+      </w:pPr>
+      <w:r>
+        <w:t># 6. Functional Requirements</w:t>
       </w:r>
     </w:p>
     <w:p>
+      <w:pPr>
+        <w:pStyle w:val="Heading2"/>
+      </w:pPr>
       <w:r>
-        <w:t>- Logic:</w:t>
+        <w:t>Access &amp; Authentication</w:t>
       </w:r>
     </w:p>
     <w:p>
+      <w:pPr>
+        <w:pStyle w:val="ListNumber"/>
+      </w:pPr>
       <w:r>
-        <w:t xml:space="preserve">  - Notification: On proposal submission, email Sensory Lead.</w:t>
+        <w:t>FR-1: The system shall authenticate internal users via McCain Azure Active Directory (AAD).</w:t>
       </w:r>
     </w:p>
     <w:p>
+      <w:pPr>
+        <w:pStyle w:val="ListNumber"/>
+      </w:pPr>
       <w:r>
-        <w:t xml:space="preserve">  - IF multiple proposals received THEN Sensory Lead selects a proposal for advancement.</w:t>
+        <w:t>FR-2: The system shall authenticate external vendor users with vendor-specific credentials provisioned based on email.</w:t>
       </w:r>
     </w:p>
     <w:p>
+      <w:pPr>
+        <w:pStyle w:val="ListNumber"/>
+      </w:pPr>
       <w:r>
-        <w:t>- UI/UX Requirement:</w:t>
+        <w:t>FR-3: The system shall restrict vendor portal access to proposal submission, SIF code/equipment/packaging entry, raw data/report uploads, and view-only of relevant test details.</w:t>
       </w:r>
     </w:p>
     <w:p>
+      <w:pPr>
+        <w:pStyle w:val="ListNumber"/>
+      </w:pPr>
       <w:r>
-        <w:t xml:space="preserve">  - For Sensory Lead, side-by-side proposal comparison view; visible “Uploaded” flags on files (no click-to-discover).</w:t>
-      </w:r>
-    </w:p>
-    <w:p/>
-    <w:p>
-      <w:r>
-        <w:t>Phase 1.5: One-Pager Compilation &amp; Approval</w:t>
+        <w:t>FR-4: The system shall present role-based dashboards for Sensory UX Lead, Line Manager, Sensory Director, R&amp;D Lead, Analytical Lead, Data Admin, and Vendor.</w:t>
       </w:r>
     </w:p>
     <w:p>
+      <w:pPr>
+        <w:pStyle w:val="Heading2"/>
+      </w:pPr>
       <w:r>
-        <w:t>- ID: Req 1.5.1</w:t>
+        <w:t>Pre-RFP, RFP &amp; Approvals</w:t>
       </w:r>
     </w:p>
     <w:p>
+      <w:pPr>
+        <w:pStyle w:val="ListNumber"/>
+      </w:pPr>
       <w:r>
-        <w:t>- Description: Consolidate vendor selection and project details into One-Pager; line manager and director review and approve.</w:t>
+        <w:t>FR-5: The system shall provide a pre-RFP one-pager approval stage for Line Manager and Sensory Director prior to sending the RFP to vendors.</w:t>
       </w:r>
     </w:p>
     <w:p>
+      <w:pPr>
+        <w:pStyle w:val="ListNumber"/>
+      </w:pPr>
       <w:r>
-        <w:t>- Logic:</w:t>
+        <w:t>FR-6: The system shall allow LM/SD to comment and request changes on the one-pager and allow Sensory UX Lead to resubmit for approval.</w:t>
       </w:r>
     </w:p>
     <w:p>
+      <w:pPr>
+        <w:pStyle w:val="ListNumber"/>
+      </w:pPr>
       <w:r>
-        <w:t xml:space="preserve">  - Approvers may Approve or Return with comments.</w:t>
+        <w:t>FR-7: Upon one-pager approval, the system shall propagate approved changes to vendor-facing RFP details and notify selected vendors of updates.</w:t>
       </w:r>
     </w:p>
     <w:p>
+      <w:pPr>
+        <w:pStyle w:val="ListNumber"/>
+      </w:pPr>
       <w:r>
-        <w:t xml:space="preserve">  - Approved One-Pager locks inputs that drive vendor scope; subsequent changes trigger vendor re-ack per Req 1.2.1.</w:t>
+        <w:t>FR-8: The system shall generate a unique ProposalID (YYS####) upon RFP creation and shall create a TestID upon approval.</w:t>
       </w:r>
     </w:p>
     <w:p>
+      <w:pPr>
+        <w:pStyle w:val="ListNumber"/>
+      </w:pPr>
       <w:r>
-        <w:t>- UI/UX Requirement:</w:t>
+        <w:t>FR-9: The system shall allow LM and SD to approve or reject with comments both the one-pager and the final Sensory Report.</w:t>
       </w:r>
     </w:p>
     <w:p>
+      <w:pPr>
+        <w:pStyle w:val="Heading2"/>
+      </w:pPr>
       <w:r>
-        <w:t xml:space="preserve">  - Track approvals with timestamps and comments; show approval status on dashboard.</w:t>
-      </w:r>
-    </w:p>
-    <w:p/>
-    <w:p>
-      <w:r>
-        <w:t>Phase 1.6: Vendor Acceptance Sign-Off</w:t>
+        <w:t>SIF, Test Planning &amp; Non-Product Tests</w:t>
       </w:r>
     </w:p>
     <w:p>
+      <w:pPr>
+        <w:pStyle w:val="ListNumber"/>
+      </w:pPr>
       <w:r>
-        <w:t>- ID: Req 1.6.1</w:t>
+        <w:t>FR-10: The system shall route the Sample Information Form (SIF) to the R&amp;D Lead for completion and to the Sensory UX Lead for review and approval, then to the vendor for codes/equipment/packaging entry.</w:t>
       </w:r>
     </w:p>
     <w:p>
+      <w:pPr>
+        <w:pStyle w:val="ListNumber"/>
+      </w:pPr>
       <w:r>
-        <w:t>- Description: Sensory Lead triggers sign-off to selected vendor, indicating test starts.</w:t>
+        <w:t>FR-11: The system shall support bulk copy/paste or file import to populate SIF fields for multiple samples in one action.</w:t>
       </w:r>
     </w:p>
     <w:p>
+      <w:pPr>
+        <w:pStyle w:val="ListNumber"/>
+      </w:pPr>
       <w:r>
-        <w:t>- Logic:</w:t>
+        <w:t>FR-12: The system shall allow export of completed SIFs to Excel and PDF formats.</w:t>
       </w:r>
     </w:p>
     <w:p>
+      <w:pPr>
+        <w:pStyle w:val="ListNumber"/>
+      </w:pPr>
       <w:r>
-        <w:t xml:space="preserve">  - Sign-off notification emailed to vendor.</w:t>
+        <w:t>FR-13: The system shall filter dropdown lists by category (e.g., show only Primary Package types in Primary Package Type).</w:t>
       </w:r>
     </w:p>
     <w:p>
+      <w:pPr>
+        <w:pStyle w:val="ListNumber"/>
+      </w:pPr>
       <w:r>
-        <w:t xml:space="preserve">  - IF sign-off not sent THEN vendor cannot upload test results.</w:t>
+        <w:t>FR-14: The system shall support non-product tests by allowing tests to bypass SIF-dependent steps without breaking workflow.</w:t>
       </w:r>
     </w:p>
     <w:p>
+      <w:pPr>
+        <w:pStyle w:val="ListNumber"/>
+      </w:pPr>
       <w:r>
-        <w:t>- UI/UX Requirement:</w:t>
+        <w:t>FR-15: The system shall generate and route a Micro Clearance Form (MCF) linked to the TestID for R&amp;D Lead acknowledgment and shall display 'Micro Cleared' status when completed.</w:t>
       </w:r>
     </w:p>
     <w:p>
+      <w:pPr>
+        <w:pStyle w:val="Heading2"/>
+      </w:pPr>
       <w:r>
-        <w:t xml:space="preserve">  - Show “Vendor Accepted” badge.</w:t>
-      </w:r>
-    </w:p>
-    <w:p/>
-    <w:p>
-      <w:r>
-        <w:t>Phase 1.7: Sample Information Form (SIF) – R&amp;D Lead</w:t>
+        <w:t>Vendor Submissions &amp; File Handling</w:t>
       </w:r>
     </w:p>
     <w:p>
+      <w:pPr>
+        <w:pStyle w:val="ListNumber"/>
+      </w:pPr>
       <w:r>
-        <w:t>- ID: Req 1.7.1</w:t>
+        <w:t>FR-16: The system shall allow vendors to upload raw sensory data (CSV), screener/questionnaire (as applicable), and sensory reports per test method.</w:t>
       </w:r>
     </w:p>
     <w:p>
+      <w:pPr>
+        <w:pStyle w:val="ListNumber"/>
+      </w:pPr>
       <w:r>
-        <w:t>- Description: R&amp;D Lead completes multi-page SIF: product info, cooking instructions, holding/delivery protocols.</w:t>
+        <w:t>FR-17: The system shall store all vendor and internal files in the designated EDP test folder and provide download links to authorized users.</w:t>
       </w:r>
     </w:p>
     <w:p>
+      <w:pPr>
+        <w:pStyle w:val="ListNumber"/>
+      </w:pPr>
       <w:r>
-        <w:t>- Logic:</w:t>
+        <w:t>FR-18: The system shall send email notifications to the Sensory UX Lead when vendors submit proposals, SIF data, raw data, or reports.</w:t>
       </w:r>
     </w:p>
     <w:p>
+      <w:pPr>
+        <w:pStyle w:val="ListNumber"/>
+      </w:pPr>
       <w:r>
-        <w:t xml:space="preserve">  - SIF required for product-based tests.</w:t>
+        <w:t>FR-19: The system shall display visible indicators of uploaded files by section without requiring users to open each link.</w:t>
       </w:r>
     </w:p>
     <w:p>
+      <w:pPr>
+        <w:pStyle w:val="Heading2"/>
+      </w:pPr>
       <w:r>
-        <w:t xml:space="preserve">  - Validation rules to prevent duplicates (e.g., NA/blank normalization) and ensure completeness (see Data Quality).</w:t>
+        <w:t>Data Transformation &amp; Reference Management</w:t>
       </w:r>
     </w:p>
     <w:p>
+      <w:pPr>
+        <w:pStyle w:val="ListNumber"/>
+      </w:pPr>
       <w:r>
-        <w:t xml:space="preserve">  - Bulk operations (Phase 2): copy/paste from Excel for batch entries.</w:t>
+        <w:t>FR-20: The system shall ingest raw vendor data into an intermediate file and compute question/attribute match scores against the reference list.</w:t>
       </w:r>
     </w:p>
     <w:p>
+      <w:pPr>
+        <w:pStyle w:val="ListNumber"/>
+      </w:pPr>
       <w:r>
-        <w:t xml:space="preserve">  - Export (Phase 2): SIF downloadable as Excel and PDF.</w:t>
+        <w:t>FR-21: The system shall flag poor or ambiguous matches for Data Admin verification and allow admins to mark items as remove/mismatch/new and provide corrected IDs or definitions.</w:t>
       </w:r>
     </w:p>
     <w:p>
+      <w:pPr>
+        <w:pStyle w:val="ListNumber"/>
+      </w:pPr>
       <w:r>
-        <w:t>- UI/UX Requirement:</w:t>
+        <w:t>FR-22: The system shall generate an output file normalized for the sensory schema and post it to the SQL database upon Data Admin approval.</w:t>
       </w:r>
     </w:p>
     <w:p>
+      <w:pPr>
+        <w:pStyle w:val="ListNumber"/>
+      </w:pPr>
       <w:r>
-        <w:t xml:space="preserve">  - Tabbed pages; progressive disclosure; dropdowns filtered by category (Primary vs Secondary vs Delivery vessels must be isolated).</w:t>
-      </w:r>
-    </w:p>
-    <w:p/>
-    <w:p>
-      <w:r>
-        <w:t>Phase 1.8: Vendor Codes &amp; Equipment</w:t>
+        <w:t>FR-23: The system shall provide an in-app UI for managing reference lists, verifying question mappings, and reviewing match score thresholds.</w:t>
       </w:r>
     </w:p>
     <w:p>
+      <w:pPr>
+        <w:pStyle w:val="ListNumber"/>
+      </w:pPr>
       <w:r>
-        <w:t>- ID: Req 1.8.1</w:t>
+        <w:t>FR-24: The system shall log Data Admin transformation decisions (e.g., comments, overrides) for audit.</w:t>
       </w:r>
     </w:p>
     <w:p>
+      <w:pPr>
+        <w:pStyle w:val="Heading2"/>
+      </w:pPr>
       <w:r>
-        <w:t>- Description: Vendor views SIF, enters sample blind codes that will match raw data, and records equipment used.</w:t>
+        <w:t>Reports, Templates &amp; Search</w:t>
       </w:r>
     </w:p>
     <w:p>
+      <w:pPr>
+        <w:pStyle w:val="ListNumber"/>
+      </w:pPr>
       <w:r>
-        <w:t>- Logic:</w:t>
+        <w:t>FR-25: The system shall allow Sensory UX Leads to upload McCain Sensory Reports and route for LM/SD approvals with comment-and-return.</w:t>
       </w:r>
     </w:p>
     <w:p>
+      <w:pPr>
+        <w:pStyle w:val="ListNumber"/>
+      </w:pPr>
       <w:r>
-        <w:t xml:space="preserve">  - Code Legend must map to raw data keys; system validates code coverage vs expected samples.</w:t>
+        <w:t>FR-26: The system shall generate a one-pager PPT from entered fields and allow users to download it.</w:t>
       </w:r>
     </w:p>
     <w:p>
+      <w:pPr>
+        <w:pStyle w:val="ListNumber"/>
+      </w:pPr>
       <w:r>
-        <w:t xml:space="preserve">  - Vendors can add equipment not in list; new equipment entries flagged for admin review.</w:t>
+        <w:t>FR-27: The system shall generate a McCain report template (PPT) pre-populated from test fields for downstream use.</w:t>
       </w:r>
     </w:p>
     <w:p>
+      <w:pPr>
+        <w:pStyle w:val="ListNumber"/>
+      </w:pPr>
       <w:r>
-        <w:t>- UI/UX Requirement:</w:t>
+        <w:t>FR-28: The system shall provide enhanced search and filter across completed tests and dashboards (e.g., region, test type, product, status).</w:t>
       </w:r>
     </w:p>
     <w:p>
+      <w:pPr>
+        <w:pStyle w:val="Heading2"/>
+      </w:pPr>
       <w:r>
-        <w:t xml:space="preserve">  - Clear code-to-sample mapping table with completeness indicator.</w:t>
-      </w:r>
-    </w:p>
-    <w:p/>
-    <w:p>
-      <w:r>
-        <w:t>Phase 1.9: Micro Clearance Acknowledgement</w:t>
+        <w:t>Collaboration, Ownership &amp; Completion Guardrails</w:t>
       </w:r>
     </w:p>
     <w:p>
+      <w:pPr>
+        <w:pStyle w:val="ListNumber"/>
+      </w:pPr>
       <w:r>
-        <w:t>- ID: Req 1.9.1</w:t>
+        <w:t>FR-29: The system shall allow multiple authorized users to edit active tests (with appropriate locking or concurrency controls) rather than limiting to a single owner.</w:t>
       </w:r>
     </w:p>
     <w:p>
+      <w:pPr>
+        <w:pStyle w:val="ListNumber"/>
+      </w:pPr>
       <w:r>
-        <w:t>- Description: R&amp;D Lead records date of microbiological clearance for pilot-line samples.</w:t>
+        <w:t>FR-30: The system shall permit Line Managers to complete the full test workflow when they are overseeing the test.</w:t>
       </w:r>
     </w:p>
     <w:p>
+      <w:pPr>
+        <w:pStyle w:val="ListNumber"/>
+      </w:pPr>
       <w:r>
-        <w:t>- Logic:</w:t>
+        <w:t>FR-31: The system shall prevent test conclusion until the Data Admin confirms data transformation completion; if overridden, the system shall require an explicit reason and log the override.</w:t>
       </w:r>
     </w:p>
     <w:p>
+      <w:pPr>
+        <w:pStyle w:val="ListNumber"/>
+      </w:pPr>
       <w:r>
-        <w:t xml:space="preserve">  - IF Micro Clearance required AND not completed THEN prevent test start in vendor portal.</w:t>
+        <w:t>FR-32: The system shall allow Data Admins to edit data after test completion and ensure updates propagate to the sensory schema and Power BI.</w:t>
       </w:r>
     </w:p>
     <w:p>
+      <w:pPr>
+        <w:pStyle w:val="Heading2"/>
+      </w:pPr>
       <w:r>
-        <w:t>- UI/UX Requirement:</w:t>
+        <w:t>Study Name Automation &amp; Admin Controls</w:t>
       </w:r>
     </w:p>
     <w:p>
+      <w:pPr>
+        <w:pStyle w:val="ListNumber"/>
+      </w:pPr>
       <w:r>
-        <w:t xml:space="preserve">  - Simple date picker and status badge “Cleared/Not Cleared”.</w:t>
-      </w:r>
-    </w:p>
-    <w:p/>
-    <w:p>
-      <w:r>
-        <w:t>Phase 1.10: Vendor File Uploads (Raw Data/Reports)</w:t>
+        <w:t>FR-33: The system shall auto-populate Study Name options based on the entered Project Number; if no match exists, users shall be able to submit a new Study Name request.</w:t>
       </w:r>
     </w:p>
     <w:p>
+      <w:pPr>
+        <w:pStyle w:val="ListNumber"/>
+      </w:pPr>
       <w:r>
-        <w:t>- ID: Req 1.10.1</w:t>
+        <w:t>FR-34: The system shall route new Study Name requests to Data Admin for approval and, upon approval, update the Study Master.</w:t>
       </w:r>
     </w:p>
     <w:p>
+      <w:pPr>
+        <w:pStyle w:val="ListNumber"/>
+      </w:pPr>
       <w:r>
-        <w:t>- Description: Vendors upload raw test data and reports into designated sections.</w:t>
+        <w:t>FR-35: The system shall provide an admin UI to manage dropdown lists (including holding protocols) without requiring direct SQL access.</w:t>
       </w:r>
     </w:p>
     <w:p>
+      <w:pPr>
+        <w:pStyle w:val="ListNumber"/>
+      </w:pPr>
       <w:r>
-        <w:t>- Logic:</w:t>
+        <w:t>FR-36: The system shall standardize inputs (e.g., normalize blanks/NA/case) and prevent duplicate master data entries where possible.</w:t>
       </w:r>
     </w:p>
     <w:p>
+      <w:pPr>
+        <w:pStyle w:val="ListNumber"/>
+      </w:pPr>
       <w:r>
-        <w:t xml:space="preserve">  - Email notification to Sensory Lead upon each upload.</w:t>
+        <w:t>FR-37: The system shall allow Data Admins to request/track provisioning of internal and vendor users and record licensing status (for visibility).</w:t>
       </w:r>
     </w:p>
     <w:p>
+      <w:pPr>
+        <w:pStyle w:val="Heading1"/>
+      </w:pPr>
       <w:r>
-        <w:t xml:space="preserve">  - Enforce allowed file types (e.g., CSV/XLSX for raw data; PDF/PPT for reports).</w:t>
+        <w:t># 7. Non-Functional Requirements (NFRs)</w:t>
       </w:r>
     </w:p>
     <w:p>
+      <w:pPr>
+        <w:pStyle w:val="Heading2"/>
+      </w:pPr>
       <w:r>
-        <w:t>- UI/UX Requirement:</w:t>
+        <w:t>Performance</w:t>
       </w:r>
     </w:p>
     <w:p>
+      <w:pPr>
+        <w:pStyle w:val="ListBullet"/>
+      </w:pPr>
       <w:r>
-        <w:t xml:space="preserve">  - Show section-level “Uploaded / Missing” icons; file names and timestamps inline.</w:t>
-      </w:r>
-    </w:p>
-    <w:p/>
-    <w:p>
-      <w:r>
-        <w:t>Phase 1.11: Data Transformation – Intermediate &amp; Output</w:t>
+        <w:t>NFR-1: The system shall provide responsive UI performance for typical workflows (dashboards, forms, uploads) for a global user base (~50–100 users in year one).</w:t>
       </w:r>
     </w:p>
     <w:p>
+      <w:pPr>
+        <w:pStyle w:val="ListBullet"/>
+      </w:pPr>
       <w:r>
-        <w:t>- ID: Req 1.11.1</w:t>
+        <w:t>NFR-2: Background data transformation jobs shall complete within reasonable timeframes relative to dataset size, with status visibility to Data Admins.</w:t>
       </w:r>
     </w:p>
     <w:p>
+      <w:pPr>
+        <w:pStyle w:val="Heading2"/>
+      </w:pPr>
       <w:r>
-        <w:t>- Description: Data Admin validates and finalizes transformation from raw to database-ready format.</w:t>
+        <w:t>Security &amp; Access</w:t>
       </w:r>
     </w:p>
     <w:p>
+      <w:pPr>
+        <w:pStyle w:val="ListBullet"/>
+      </w:pPr>
       <w:r>
-        <w:t>- Logic:</w:t>
+        <w:t>NFR-3: Internal access shall leverage AAD with least-privilege role-based access controls.</w:t>
       </w:r>
     </w:p>
     <w:p>
+      <w:pPr>
+        <w:pStyle w:val="ListBullet"/>
+      </w:pPr>
       <w:r>
-        <w:t xml:space="preserve">  - Intermediate File:</w:t>
+        <w:t>NFR-4: Vendor access shall use separate credentials and be limited strictly to vendor-specific submission and view-only areas.</w:t>
       </w:r>
     </w:p>
     <w:p>
+      <w:pPr>
+        <w:pStyle w:val="ListBullet"/>
+      </w:pPr>
       <w:r>
-        <w:t xml:space="preserve">    - Auto-generate Code Legend to decode products from vendor codes.</w:t>
+        <w:t>NFR-5: Security testing (e.g., vulnerability assessment) shall be performed given external vendor access; identified issues shall be remediated.</w:t>
       </w:r>
     </w:p>
     <w:p>
+      <w:pPr>
+        <w:pStyle w:val="ListBullet"/>
+      </w:pPr>
       <w:r>
-        <w:t xml:space="preserve">    - Reformatted tab: Map submitted questions to DB Question IDs; calculate match score.</w:t>
+        <w:t>NFR-6: Files shall be stored securely in the EDP with appropriate permissions; sensitive data shall not be exposed to unauthorized users.</w:t>
       </w:r>
     </w:p>
     <w:p>
+      <w:pPr>
+        <w:pStyle w:val="Heading2"/>
+      </w:pPr>
       <w:r>
-        <w:t xml:space="preserve">    - Score thresholds (to be defined): </w:t>
+        <w:t>Availability &amp; Reliability</w:t>
       </w:r>
     </w:p>
     <w:p>
+      <w:pPr>
+        <w:pStyle w:val="ListBullet"/>
+      </w:pPr>
       <w:r>
-        <w:t xml:space="preserve">      - IF score &gt;= Exact_Threshold THEN auto-accept; status “Exact Match”.</w:t>
+        <w:t>NFR-7: Implement observability/monitoring to detect application availability issues and critical workflow failures (e.g., upload/transform), with alerting to support.</w:t>
       </w:r>
     </w:p>
     <w:p>
+      <w:pPr>
+        <w:pStyle w:val="ListBullet"/>
+      </w:pPr>
       <w:r>
-        <w:t xml:space="preserve">      - IF score in [Review_Low, Review_High) THEN status “Check”.</w:t>
+        <w:t>NFR-8: The system shall provide clear error messages and retry mechanisms for transient failures in uploads or transformations.</w:t>
       </w:r>
     </w:p>
     <w:p>
+      <w:pPr>
+        <w:pStyle w:val="Heading2"/>
+      </w:pPr>
       <w:r>
-        <w:t xml:space="preserve">      - IF score &lt; Poor_Threshold THEN status “Poor Match”.</w:t>
+        <w:t>Usability &amp; UX</w:t>
       </w:r>
     </w:p>
     <w:p>
+      <w:pPr>
+        <w:pStyle w:val="ListBullet"/>
+      </w:pPr>
       <w:r>
-        <w:t xml:space="preserve">    - Data Admin Actions:</w:t>
+        <w:t>NFR-9: The system shall minimize horizontal scrolling and organize forms for efficient data entry on laptops.</w:t>
       </w:r>
     </w:p>
     <w:p>
+      <w:pPr>
+        <w:pStyle w:val="ListBullet"/>
+      </w:pPr>
       <w:r>
-        <w:t xml:space="preserve">      - Leave blank to accept.</w:t>
+        <w:t>NFR-10: The system shall clearly display uploaded file presence/status per section.</w:t>
       </w:r>
     </w:p>
     <w:p>
+      <w:pPr>
+        <w:pStyle w:val="ListBullet"/>
+      </w:pPr>
       <w:r>
-        <w:t xml:space="preserve">      - Enter “remove” to drop a question.</w:t>
+        <w:t>NFR-11: The system shall provide intuitive filters and search to locate tests by key attributes (e.g., region, test type, product).</w:t>
       </w:r>
     </w:p>
     <w:p>
+      <w:pPr>
+        <w:pStyle w:val="ListBullet"/>
+      </w:pPr>
       <w:r>
-        <w:t xml:space="preserve">      - Enter “mismatch” and specify corrected Question ID.</w:t>
+        <w:t>NFR-12: Dropdowns shall present context-relevant options only (e.g., category-filtered lists).</w:t>
       </w:r>
     </w:p>
     <w:p>
+      <w:pPr>
+        <w:pStyle w:val="Heading2"/>
+      </w:pPr>
       <w:r>
-        <w:t xml:space="preserve">      - Enter “new” and add a new sheet with question definition for creation.</w:t>
+        <w:t>Auditability &amp; Logging</w:t>
       </w:r>
     </w:p>
     <w:p>
+      <w:pPr>
+        <w:pStyle w:val="ListBullet"/>
+      </w:pPr>
       <w:r>
-        <w:t xml:space="preserve">  - Output File:</w:t>
+        <w:t>NFR-13: Approval actions (LM/SD), admin bypasses, post-completion edits, and transformation decisions shall be audit-logged with user, timestamp, and details.</w:t>
       </w:r>
     </w:p>
     <w:p>
+      <w:pPr>
+        <w:pStyle w:val="ListBullet"/>
+      </w:pPr>
       <w:r>
-        <w:t xml:space="preserve">    - Restructure wide vendor format to long format per respondent per product per question.</w:t>
+        <w:t>NFR-14: Vendor submissions and notifications shall be logged for traceability.</w:t>
       </w:r>
     </w:p>
     <w:p>
+      <w:pPr>
+        <w:pStyle w:val="Heading2"/>
+      </w:pPr>
       <w:r>
-        <w:t xml:space="preserve">    - Populate Consumer, Respondent, and related target tables with resolved Question IDs.</w:t>
+        <w:t>Compliance &amp; Privacy</w:t>
       </w:r>
     </w:p>
     <w:p>
+      <w:pPr>
+        <w:pStyle w:val="ListBullet"/>
+      </w:pPr>
       <w:r>
-        <w:t xml:space="preserve">  - Audit:</w:t>
+        <w:t>NFR-15: The system shall handle consumer and vendor data in accordance with internal policies and applicable privacy/security standards.</w:t>
       </w:r>
     </w:p>
     <w:p>
+      <w:pPr>
+        <w:pStyle w:val="Heading2"/>
+      </w:pPr>
       <w:r>
-        <w:t xml:space="preserve">    - Capture who performed mappings, timestamps, and decisions.</w:t>
+        <w:t>Data Quality</w:t>
       </w:r>
     </w:p>
     <w:p>
+      <w:pPr>
+        <w:pStyle w:val="ListBullet"/>
+      </w:pPr>
       <w:r>
-        <w:t>- UI/UX Requirement:</w:t>
+        <w:t>NFR-16: Implement standardization rules (e.g., blanks vs NA, case normalization) and validations to reduce duplicate or inconsistent master data.</w:t>
       </w:r>
     </w:p>
     <w:p>
+      <w:pPr>
+        <w:pStyle w:val="ListBullet"/>
+      </w:pPr>
       <w:r>
-        <w:t xml:space="preserve">  - Admin-facing validation screen showing mapping statuses, scores, filters by status (Exact/Check/Poor), and bulk actions.</w:t>
-      </w:r>
-    </w:p>
-    <w:p/>
-    <w:p>
-      <w:r>
-        <w:t>Phase 1.12: McCain Report Creation &amp; Approval</w:t>
+        <w:t>NFR-17: Provide Data Admin review workflows for low-confidence mappings with clear status indicators.</w:t>
       </w:r>
     </w:p>
     <w:p>
+      <w:pPr>
+        <w:pStyle w:val="Heading1"/>
+      </w:pPr>
       <w:r>
-        <w:t>- ID: Req 1.12.1</w:t>
+        <w:t># 8. Data Requirements</w:t>
       </w:r>
     </w:p>
     <w:p>
+      <w:pPr>
+        <w:pStyle w:val="Heading2"/>
+      </w:pPr>
       <w:r>
-        <w:t>- Description: Sensory Lead compiles internal report; submits for line manager/director approval.</w:t>
+        <w:t>## 8.1 Entities / Objects (if stated)</w:t>
       </w:r>
     </w:p>
     <w:p>
+      <w:pPr>
+        <w:pStyle w:val="ListBullet"/>
+      </w:pPr>
       <w:r>
-        <w:t>- Logic:</w:t>
+        <w:t>Proposal (ProposalID YYS####); Test (TestID); One-Pager; SIF; Micro Clearance Form (MCF).</w:t>
       </w:r>
     </w:p>
     <w:p>
+      <w:pPr>
+        <w:pStyle w:val="ListBullet"/>
+      </w:pPr>
       <w:r>
-        <w:t xml:space="preserve">  - Approvers can Approve or Return with comments.</w:t>
+        <w:t>Vendor; Sensory UX Lead; LM; SD; R&amp;D Lead; Analytical Lead; Data Admin; User/Role.</w:t>
       </w:r>
     </w:p>
     <w:p>
+      <w:pPr>
+        <w:pStyle w:val="ListBullet"/>
+      </w:pPr>
       <w:r>
-        <w:t xml:space="preserve">  - Phase 2 Output: Auto-generate report PPT sections from entered fields (objectives, background, action standards).</w:t>
+        <w:t>Product; Sample; Codes (blind codes/legend); Lot Codes; Cooking Instructions; Holding Protocol; Equipment; Packaging; Delivery Scenario.</w:t>
       </w:r>
     </w:p>
     <w:p>
+      <w:pPr>
+        <w:pStyle w:val="ListBullet"/>
+      </w:pPr>
       <w:r>
-        <w:t>- UI/UX Requirement:</w:t>
+        <w:t>Raw Data (CSV); Screener; Questionnaire; Vendor Sensory Report; McCain Sensory Report; EDP Test Folder.</w:t>
       </w:r>
     </w:p>
     <w:p>
+      <w:pPr>
+        <w:pStyle w:val="ListBullet"/>
+      </w:pPr>
       <w:r>
-        <w:t xml:space="preserve">  - “Generate Report PPT” button with post-editable template.</w:t>
-      </w:r>
-    </w:p>
-    <w:p/>
-    <w:p>
-      <w:r>
-        <w:t>Phase 1.13: Test Conclusion (Gated)</w:t>
+        <w:t>Question/Attribute Reference List; Respondent; Category Mapping; Study; Project Number; Budget/PO (tracking fields).</w:t>
       </w:r>
     </w:p>
     <w:p>
+      <w:pPr>
+        <w:pStyle w:val="Heading2"/>
+      </w:pPr>
       <w:r>
-        <w:t>- ID: Req 1.13.1</w:t>
+        <w:t>## 8.2 Key fields &amp; validations (if stated)</w:t>
       </w:r>
     </w:p>
     <w:p>
+      <w:pPr>
+        <w:pStyle w:val="ListBullet"/>
+      </w:pPr>
       <w:r>
-        <w:t>- Description: Sensory Lead concludes test, moving it to Completed view.</w:t>
+        <w:t>RFP/One-Pager: Background, Objectives, Actions, Vendors selected, Cost Estimate, Currency.</w:t>
       </w:r>
     </w:p>
     <w:p>
+      <w:pPr>
+        <w:pStyle w:val="ListBullet"/>
+      </w:pPr>
       <w:r>
-        <w:t>- Logic:</w:t>
+        <w:t>SIF: Product details, Cooking Instructions, Holding Protocol, Equipment, Packaging types, Sample Codes, Lot Codes.</w:t>
       </w:r>
     </w:p>
     <w:p>
+      <w:pPr>
+        <w:pStyle w:val="ListBullet"/>
+      </w:pPr>
       <w:r>
-        <w:t xml:space="preserve">  - IF Transformation status != Completed (intermediate validated + output loaded to sensory schema) THEN block Conclusion; display blocking message.</w:t>
+        <w:t>MCF: Micro clearance date acknowledgment.</w:t>
       </w:r>
     </w:p>
     <w:p>
+      <w:pPr>
+        <w:pStyle w:val="ListBullet"/>
+      </w:pPr>
       <w:r>
-        <w:t xml:space="preserve">  - IF concluded THEN freeze writes to RND staging, push finalized records to Sensory schema.</w:t>
+        <w:t>Validation: Category-filtered dropdowns (e.g., primary package vs secondary/delivery vessel).</w:t>
       </w:r>
     </w:p>
     <w:p>
+      <w:pPr>
+        <w:pStyle w:val="ListBullet"/>
+      </w:pPr>
       <w:r>
-        <w:t xml:space="preserve">  - Phase 2: Allow Data Admin to edit select fields post-completion with audit trail; on save, auto-propagate to Sensory schema.</w:t>
+        <w:t>Validation: Required fields, code legend alignment to raw data, file-type checks for CSV uploads.</w:t>
       </w:r>
     </w:p>
     <w:p>
+      <w:pPr>
+        <w:pStyle w:val="ListBullet"/>
+      </w:pPr>
       <w:r>
-        <w:t>- UI/UX Requirement:</w:t>
+        <w:t>Standardization: Normalize blanks/NA; enforce consistent casing to avoid duplicate masters.</w:t>
       </w:r>
     </w:p>
     <w:p>
+      <w:pPr>
+        <w:pStyle w:val="Heading2"/>
+      </w:pPr>
       <w:r>
-        <w:t xml:space="preserve">  - Confirmation dialog references transformation status; show links to unresolved items.</w:t>
-      </w:r>
-    </w:p>
-    <w:p/>
-    <w:p>
-      <w:r>
-        <w:t>Workflow 2: Analytical (Internal)</w:t>
+        <w:t>## 8.3 Data quality rules (if stated)</w:t>
       </w:r>
     </w:p>
     <w:p>
+      <w:pPr>
+        <w:pStyle w:val="ListBullet"/>
+      </w:pPr>
       <w:r>
-        <w:t>Phase 2.1: Create Analytical Test</w:t>
+        <w:t>Mapping confidence thresholds shall flag poor/ambiguous matches for review.</w:t>
       </w:r>
     </w:p>
     <w:p>
+      <w:pPr>
+        <w:pStyle w:val="ListBullet"/>
+      </w:pPr>
       <w:r>
-        <w:t>- ID: Req 2.1.1</w:t>
+        <w:t>Transformation decisions (remove/mismatch/new) shall be captured and reflected in output.</w:t>
       </w:r>
     </w:p>
     <w:p>
+      <w:pPr>
+        <w:pStyle w:val="ListBullet"/>
+      </w:pPr>
       <w:r>
-        <w:t>- Description: Analytical Lead creates test with minimal background data.</w:t>
+        <w:t>Post-completion edits by Data Admin shall overwrite prior values with audit trail.</w:t>
       </w:r>
     </w:p>
     <w:p>
+      <w:pPr>
+        <w:pStyle w:val="Heading1"/>
+      </w:pPr>
       <w:r>
-        <w:t>- Logic:</w:t>
+        <w:t># 9. Integrations &amp; Interfaces</w:t>
       </w:r>
     </w:p>
     <w:p>
+      <w:pPr>
+        <w:pStyle w:val="ListBullet"/>
+      </w:pPr>
       <w:r>
-        <w:t xml:space="preserve">  - No vendor or management approval steps.</w:t>
+        <w:t>Systems involved:</w:t>
       </w:r>
     </w:p>
     <w:p>
+      <w:pPr>
+        <w:pStyle w:val="ListBullet2"/>
+      </w:pPr>
       <w:r>
-        <w:t>- UI/UX Requirement:</w:t>
+        <w:t>Power Apps (Stakeholder portal, Vendor portal); SQL DB (R&amp;D schema, Sensory schema); Power BI; EDP (e.g., SharePoint); Power Automate; AAD.</w:t>
       </w:r>
     </w:p>
     <w:p>
+      <w:pPr>
+        <w:pStyle w:val="ListBullet"/>
+      </w:pPr>
       <w:r>
-        <w:t xml:space="preserve">  - Simplified form; defaults for standard instrument tests.</w:t>
-      </w:r>
-    </w:p>
-    <w:p/>
-    <w:p>
-      <w:r>
-        <w:t>Phase 2.2: Plan Sample Info</w:t>
+        <w:t>Direction / triggers / frequency:</w:t>
       </w:r>
     </w:p>
     <w:p>
+      <w:pPr>
+        <w:pStyle w:val="ListBullet2"/>
+      </w:pPr>
       <w:r>
-        <w:t>- ID: Req 2.2.1</w:t>
+        <w:t>Vendor uploads (CSV/reports) -&gt; EDP storage -&gt; notifications -&gt; transformation -&gt; sensory schema ingestion.</w:t>
       </w:r>
     </w:p>
     <w:p>
+      <w:pPr>
+        <w:pStyle w:val="ListBullet2"/>
+      </w:pPr>
       <w:r>
-        <w:t>- Description: Enter sample details analogous to SIF (reduced scope).</w:t>
+        <w:t>Approvals and workflow transitions -&gt; email notifications via Power Automate.</w:t>
       </w:r>
     </w:p>
     <w:p>
+      <w:pPr>
+        <w:pStyle w:val="ListBullet2"/>
+      </w:pPr>
       <w:r>
-        <w:t>- Logic:</w:t>
+        <w:t>Holding tables in app (R&amp;D schema) until test completion -&gt; push to sensory schema.</w:t>
       </w:r>
     </w:p>
     <w:p>
+      <w:pPr>
+        <w:pStyle w:val="ListBullet"/>
+      </w:pPr>
       <w:r>
-        <w:t xml:space="preserve">  - Basic validations (no duplicate entries; required fields).</w:t>
+        <w:t>Error handling expectations (if stated):</w:t>
       </w:r>
     </w:p>
     <w:p>
+      <w:pPr>
+        <w:pStyle w:val="ListBullet2"/>
+      </w:pPr>
       <w:r>
-        <w:t>- UI/UX Requirement:</w:t>
+        <w:t>Flag failed uploads/transforms, provide visibility to Data Admin, allow retry/resubmission.</w:t>
       </w:r>
     </w:p>
     <w:p>
+      <w:pPr>
+        <w:pStyle w:val="ListBullet"/>
+      </w:pPr>
       <w:r>
-        <w:t xml:space="preserve">  - Streamlined layout.</w:t>
-      </w:r>
-    </w:p>
-    <w:p/>
-    <w:p>
-      <w:r>
-        <w:t>Phase 2.3: Upload Analytical Data</w:t>
+        <w:t>Future (out of scope for this phase): Integrations to SAP/Coupa (PO/vendor master) and TraceGains.</w:t>
       </w:r>
     </w:p>
     <w:p>
+      <w:pPr>
+        <w:pStyle w:val="Heading1"/>
+      </w:pPr>
       <w:r>
-        <w:t>- ID: Req 2.3.1</w:t>
+        <w:t># 10. Reporting / Analytics (if applicable)</w:t>
       </w:r>
     </w:p>
     <w:p>
+      <w:pPr>
+        <w:pStyle w:val="ListBullet"/>
+      </w:pPr>
       <w:r>
-        <w:t>- Description: Upload instrument measurement data; transform to database format.</w:t>
+        <w:t>Dashboards/reports required:</w:t>
       </w:r>
     </w:p>
     <w:p>
+      <w:pPr>
+        <w:pStyle w:val="ListBullet2"/>
+      </w:pPr>
       <w:r>
-        <w:t>- Logic:</w:t>
+        <w:t>Power BI reports on tests by product, region, test type; completed vs active; vendor submissions; mapping quality indicators (admin).</w:t>
       </w:r>
     </w:p>
     <w:p>
+      <w:pPr>
+        <w:pStyle w:val="ListBullet"/>
+      </w:pPr>
       <w:r>
-        <w:t xml:space="preserve">  - Apply transformation to normalize structure for Power BI.</w:t>
+        <w:t>Filters/dimensions:</w:t>
       </w:r>
     </w:p>
     <w:p>
+      <w:pPr>
+        <w:pStyle w:val="ListBullet2"/>
+      </w:pPr>
       <w:r>
-        <w:t>- UI/UX Requirement:</w:t>
+        <w:t>Region, Test Type (Consumer Quant, DA-Spectrum, QA-QDA, Other), Product, Status, Vendor, Date.</w:t>
       </w:r>
     </w:p>
     <w:p>
+      <w:pPr>
+        <w:pStyle w:val="ListBullet"/>
+      </w:pPr>
       <w:r>
-        <w:t xml:space="preserve">  - Upload status and data quality checks.</w:t>
-      </w:r>
-    </w:p>
-    <w:p/>
-    <w:p>
-      <w:r>
-        <w:t>Cross-Workflow Admin Functions</w:t>
+        <w:t>Intended users:</w:t>
       </w:r>
     </w:p>
     <w:p>
+      <w:pPr>
+        <w:pStyle w:val="ListBullet2"/>
+      </w:pPr>
       <w:r>
-        <w:t>Phase A.1: Vendor &amp; User Administration</w:t>
+        <w:t>Sensory UX Leads, LMs, SDs, R&amp;D Leads, Analytical Leads, Data Admins.</w:t>
       </w:r>
     </w:p>
     <w:p>
+      <w:pPr>
+        <w:pStyle w:val="Heading1"/>
+      </w:pPr>
       <w:r>
-        <w:t>- ID: Req A.1.1</w:t>
+        <w:t># 11. SLAs &amp; Operational Expectations</w:t>
       </w:r>
     </w:p>
     <w:p>
+      <w:pPr>
+        <w:pStyle w:val="ListBullet"/>
+      </w:pPr>
       <w:r>
-        <w:t>- Description: Data Admin manages vendor users and internal users.</w:t>
+        <w:t>SLAs or processing expectations (if stated):</w:t>
       </w:r>
     </w:p>
     <w:p>
+      <w:pPr>
+        <w:pStyle w:val="ListBullet2"/>
+      </w:pPr>
       <w:r>
-        <w:t>- Logic:</w:t>
+        <w:t>Not stated; desire for observability and proactive monitoring given global user base and vendor access.</w:t>
       </w:r>
     </w:p>
     <w:p>
+      <w:pPr>
+        <w:pStyle w:val="ListBullet"/>
+      </w:pPr>
       <w:r>
-        <w:t xml:space="preserve">  - Vendor adds require license request to Platform Admin (Kaushal) and activation.</w:t>
+        <w:t>Operational ownership/support model (if stated):</w:t>
       </w:r>
     </w:p>
     <w:p>
+      <w:pPr>
+        <w:pStyle w:val="ListBullet2"/>
+      </w:pPr>
       <w:r>
-        <w:t xml:space="preserve">  - Internal users created via AD; Platform Admin approval required.</w:t>
+        <w:t>Incident-only support by vendor (1 Power Apps developer, 1 Python engineer) post-hypercare; Data Admins track incidents (~45 logged).</w:t>
       </w:r>
     </w:p>
     <w:p>
+      <w:pPr>
+        <w:pStyle w:val="Heading1"/>
+      </w:pPr>
       <w:r>
-        <w:t>- UI/UX Requirement:</w:t>
+        <w:t># 12. Risks, Dependencies, and Assumptions</w:t>
       </w:r>
     </w:p>
     <w:p>
+      <w:pPr>
+        <w:pStyle w:val="ListBullet"/>
+      </w:pPr>
       <w:r>
-        <w:t xml:space="preserve">  - Self-service request queue and status; reduce email-only dependencies (Phase 2 enhancement).</w:t>
-      </w:r>
-    </w:p>
-    <w:p/>
-    <w:p>
-      <w:r>
-        <w:t>Phase A.2: Dropdown &amp; Category Management</w:t>
+        <w:t>Risks:</w:t>
       </w:r>
     </w:p>
     <w:p>
+      <w:pPr>
+        <w:pStyle w:val="ListBullet2"/>
+      </w:pPr>
       <w:r>
-        <w:t>- ID: Req A.2.1</w:t>
+        <w:t>Data transformation matching accuracy lower than expected; supervised learning not improving matching over time.</w:t>
       </w:r>
     </w:p>
     <w:p>
+      <w:pPr>
+        <w:pStyle w:val="ListBullet2"/>
+      </w:pPr>
       <w:r>
-        <w:t>- Description: Admin manages dropdowns and three-level dependent lists (e.g., Country/Region; Primary/Secondary/Delivery types).</w:t>
+        <w:t>UX limitations may persist due to platform constraints; user frustration and productivity impacts.</w:t>
       </w:r>
     </w:p>
     <w:p>
+      <w:pPr>
+        <w:pStyle w:val="ListBullet2"/>
+      </w:pPr>
       <w:r>
-        <w:t>- Logic:</w:t>
+        <w:t>Lack of performance/security testing and observability increases operational risk with external access.</w:t>
       </w:r>
     </w:p>
     <w:p>
+      <w:pPr>
+        <w:pStyle w:val="ListBullet2"/>
+      </w:pPr>
       <w:r>
-        <w:t xml:space="preserve">  - IF field = Primary Package Type THEN only show Primary Package entries; similarly for Secondary/Delivery.</w:t>
+        <w:t>Single-vendor incident support may constrain enhancement velocity.</w:t>
       </w:r>
     </w:p>
     <w:p>
+      <w:pPr>
+        <w:pStyle w:val="ListBullet"/>
+      </w:pPr>
       <w:r>
-        <w:t>- UI/UX Requirement:</w:t>
+        <w:t>Dependencies:</w:t>
       </w:r>
     </w:p>
     <w:p>
+      <w:pPr>
+        <w:pStyle w:val="ListBullet2"/>
+      </w:pPr>
       <w:r>
-        <w:t xml:space="preserve">  - Table editor for bulk updates (must support 700+ questions, 500+ attributes) with filters and search.</w:t>
-      </w:r>
-    </w:p>
-    <w:p/>
-    <w:p>
-      <w:r>
-        <w:t>Phase A.3: Bypass Approvals (Existing)</w:t>
+        <w:t>Power Apps, SQL (R&amp;D &amp; sensory schemas), Power Automate, EDP (SharePoint), Power BI, AAD.</w:t>
       </w:r>
     </w:p>
     <w:p>
+      <w:pPr>
+        <w:pStyle w:val="ListBullet2"/>
+      </w:pPr>
       <w:r>
-        <w:t>- ID: Req A.3.1</w:t>
+        <w:t>Platform team for user provisioning; vendor licenses for external users; LM/SD availability for approvals.</w:t>
       </w:r>
     </w:p>
     <w:p>
+      <w:pPr>
+        <w:pStyle w:val="Heading1"/>
+      </w:pPr>
       <w:r>
-        <w:t>- Description: Admin can bypass approval steps when approvers are unavailable.</w:t>
+        <w:t># 13. Timeline &amp; Milestones</w:t>
       </w:r>
     </w:p>
     <w:p>
+      <w:pPr>
+        <w:pStyle w:val="ListBullet"/>
+      </w:pPr>
       <w:r>
-        <w:t>- Logic:</w:t>
+        <w:t>Key milestones/dates (if stated):</w:t>
       </w:r>
     </w:p>
     <w:p>
+      <w:pPr>
+        <w:pStyle w:val="ListBullet2"/>
+      </w:pPr>
       <w:r>
-        <w:t xml:space="preserve">  - Capture reason and timestamp; notify approvers of bypass event.</w:t>
+        <w:t>Initial go-live: ~2025-03-01 (development Oct 2024–Feb 2025; UAT and stabilization followed).</w:t>
       </w:r>
     </w:p>
     <w:p>
+      <w:pPr>
+        <w:pStyle w:val="ListBullet2"/>
+      </w:pPr>
       <w:r>
-        <w:t>- UI/UX Requirement:</w:t>
+        <w:t>Phase 2: Ballpark estimate requested by 2025-06-06; verbal estimate discussed of 3–6 months subject to team sizing and parallelization.</w:t>
       </w:r>
     </w:p>
     <w:p>
+      <w:pPr>
+        <w:pStyle w:val="ListBullet"/>
+      </w:pPr>
       <w:r>
-        <w:t xml:space="preserve">  - Bypass button visible only to Admin with warning dialog.</w:t>
-      </w:r>
-    </w:p>
-    <w:p/>
-    <w:p>
-      <w:r>
-        <w:t>4. Data Transformation &amp; Mapping Logic</w:t>
-      </w:r>
-    </w:p>
-    <w:p/>
-    <w:p>
-      <w:r>
-        <w:t>Input Raw Data Formats</w:t>
+        <w:t>Release approach (if stated):</w:t>
       </w:r>
     </w:p>
     <w:p>
+      <w:pPr>
+        <w:pStyle w:val="ListBullet2"/>
+      </w:pPr>
       <w:r>
-        <w:t>- Vendor-submitted files in varied structures (CSV/XLSX). Standard template encouraged but not enforced due to vendor diversity and test types.</w:t>
-      </w:r>
-    </w:p>
-    <w:p/>
-    <w:p>
-      <w:r>
-        <w:t>Core Transformation Steps</w:t>
+        <w:t>Not specified; expectation to prioritize high-impact UX and transformation features and deliver iteratively.</w:t>
       </w:r>
     </w:p>
     <w:p>
+      <w:pPr>
+        <w:pStyle w:val="Heading1"/>
+      </w:pPr>
       <w:r>
-        <w:t>- Code Legend:</w:t>
+        <w:t># 14. Open Questions (to finalize BRD)</w:t>
       </w:r>
     </w:p>
     <w:p>
+      <w:pPr>
+        <w:pStyle w:val="ListNumber"/>
+      </w:pPr>
       <w:r>
-        <w:t xml:space="preserve">  - Decode vendor sample codes to product/sample identifiers as specified in SIF; error if codes do not cover all expected samples.</w:t>
+        <w:t>OQ-1: Scope and design details for the pre-RFP one-pager (exact fields, approval SLAs, change propagation rules to vendor RFP).</w:t>
       </w:r>
     </w:p>
     <w:p>
+      <w:pPr>
+        <w:pStyle w:val="ListNumber"/>
+      </w:pPr>
       <w:r>
-        <w:t>- Question Mapping:</w:t>
+        <w:t>OQ-2: Post-completion edit governance: who can edit which fields, required approvals (if any), and audit/reporting requirements.</w:t>
       </w:r>
     </w:p>
     <w:p>
+      <w:pPr>
+        <w:pStyle w:val="ListNumber"/>
+      </w:pPr>
       <w:r>
-        <w:t xml:space="preserve">  - Compare incoming question text and answer options to master Question DB.</w:t>
+        <w:t>OQ-3: Data transformation improvements: target matching accuracy, acceptable thresholds, and whether supervised learning will be implemented.</w:t>
       </w:r>
     </w:p>
     <w:p>
+      <w:pPr>
+        <w:pStyle w:val="ListNumber"/>
+      </w:pPr>
       <w:r>
-        <w:t xml:space="preserve">  - Compute match score (string similarity and option-set compatibility).</w:t>
+        <w:t>OQ-4: Collaboration model: locking vs. concurrent editing for multiple editors on a single active test.</w:t>
       </w:r>
     </w:p>
     <w:p>
+      <w:pPr>
+        <w:pStyle w:val="ListNumber"/>
+      </w:pPr>
       <w:r>
-        <w:t xml:space="preserve">  - Status classification:</w:t>
+        <w:t>OQ-5: Non-product tests: required metadata and minimal steps when SIF is bypassed.</w:t>
       </w:r>
     </w:p>
     <w:p>
+      <w:pPr>
+        <w:pStyle w:val="ListNumber"/>
+      </w:pPr>
       <w:r>
-        <w:t xml:space="preserve">    - Exact Match: score ≥ Exact_Threshold → auto-accept.</w:t>
+        <w:t>OQ-6: SIF bulk import format (e.g., Excel template) and validation rules.</w:t>
       </w:r>
     </w:p>
     <w:p>
+      <w:pPr>
+        <w:pStyle w:val="ListNumber"/>
+      </w:pPr>
       <w:r>
-        <w:t xml:space="preserve">    - Check: Review_Low ≤ score &lt; Review_High → flag for admin check.</w:t>
+        <w:t>OQ-7: One-pager and McCain report PPT templates: final layouts and fields to auto-populate.</w:t>
       </w:r>
     </w:p>
     <w:p>
+      <w:pPr>
+        <w:pStyle w:val="ListNumber"/>
+      </w:pPr>
       <w:r>
-        <w:t xml:space="preserve">    - Poor Match: score &lt; Poor_Threshold → likely remove or add as new.</w:t>
+        <w:t>OQ-8: Test completion guard: confirm whether a hard block is required vs. overridable confirmation, and ownership of the 'transformation complete' signal.</w:t>
       </w:r>
     </w:p>
     <w:p>
+      <w:pPr>
+        <w:pStyle w:val="ListNumber"/>
+      </w:pPr>
       <w:r>
-        <w:t>- Admin Overrides:</w:t>
+        <w:t>OQ-9: Study Name automation: definitive mapping rules for Project Number → Study Name and approval workflow for new entries.</w:t>
       </w:r>
     </w:p>
     <w:p>
+      <w:pPr>
+        <w:pStyle w:val="ListNumber"/>
+      </w:pPr>
       <w:r>
-        <w:t xml:space="preserve">  - IF Decision = “remove” THEN exclude question from output.</w:t>
+        <w:t>OQ-10: Security/performance testing scope, tools, owners, and acceptance criteria; monitoring/alerting tool selection.</w:t>
       </w:r>
     </w:p>
     <w:p>
+      <w:pPr>
+        <w:pStyle w:val="ListNumber"/>
+      </w:pPr>
       <w:r>
-        <w:t xml:space="preserve">  - IF Decision = “mismatch” AND CorrectedID provided THEN map to CorrectedID.</w:t>
+        <w:t>OQ-11: Dropdown taxonomy for packaging/holding/delivery categories to drive context-relevant options.</w:t>
       </w:r>
     </w:p>
     <w:p>
+      <w:pPr>
+        <w:pStyle w:val="ListNumber"/>
+      </w:pPr>
       <w:r>
-        <w:t xml:space="preserve">  - IF Decision = “new” THEN create a New-Question definition (sheet) with:</w:t>
+        <w:t>OQ-12: Any usage analytics/reporting requirements (e.g., user logins, active tests by region) to track adoption and ROI.</w:t>
       </w:r>
     </w:p>
     <w:p>
+      <w:pPr>
+        <w:pStyle w:val="Heading1"/>
+      </w:pPr>
       <w:r>
-        <w:t xml:space="preserve">    - Question text, answer options, scale, category, language, effective date.</w:t>
+        <w:t># 15. Source Notes</w:t>
       </w:r>
     </w:p>
     <w:p>
+      <w:pPr>
+        <w:pStyle w:val="ListBullet"/>
+      </w:pPr>
       <w:r>
-        <w:t xml:space="preserve">    - On approval, new Question ID generated and mapping updated.</w:t>
+        <w:t>Primary notes used: INPUTS_TEXT (Meeting transcript: RnD Sensory - Roadmap Discussion-20250530_173643).</w:t>
       </w:r>
     </w:p>
     <w:p>
+      <w:pPr>
+        <w:pStyle w:val="ListBullet"/>
+      </w:pPr>
       <w:r>
-        <w:t>- Category Mapping:</w:t>
-      </w:r>
-    </w:p>
-    <w:p>
-      <w:r>
-        <w:t xml:space="preserve">  - IF Test Type = Descriptive Analysis AND Product Category = X THEN use attribute list (panelist attributes) defined for Category X.</w:t>
-      </w:r>
-    </w:p>
-    <w:p>
-      <w:r>
-        <w:t>- Restructuring Wide → Long:</w:t>
-      </w:r>
-    </w:p>
-    <w:p>
-      <w:r>
-        <w:t xml:space="preserve">  - For each Respondent and Product: pivot responses from columns into rows.</w:t>
-      </w:r>
-    </w:p>
-    <w:p>
-      <w:r>
-        <w:t xml:space="preserve">  - Populate:</w:t>
-      </w:r>
-    </w:p>
-    <w:p>
-      <w:r>
-        <w:t xml:space="preserve">    - Consumer table (test-level info)</w:t>
-      </w:r>
-    </w:p>
-    <w:p>
-      <w:r>
-        <w:t xml:space="preserve">    - Respondent table (participant-level)</w:t>
-      </w:r>
-    </w:p>
-    <w:p>
-      <w:r>
-        <w:t xml:space="preserve">    - Response table (question-level long format)</w:t>
-      </w:r>
-    </w:p>
-    <w:p>
-      <w:r>
-        <w:t xml:space="preserve">  - Preserve foreign keys (TestID, RespondentID, ProductID, QuestionID).</w:t>
-      </w:r>
-    </w:p>
-    <w:p>
-      <w:r>
-        <w:t>- Finalization:</w:t>
-      </w:r>
-    </w:p>
-    <w:p>
-      <w:r>
-        <w:t xml:space="preserve">  - On Data Admin “Transform Complete,” generate Output File and push to Sensory schema.</w:t>
-      </w:r>
-    </w:p>
-    <w:p>
-      <w:r>
-        <w:t>- Data Quality Normalization:</w:t>
-      </w:r>
-    </w:p>
-    <w:p>
-      <w:r>
-        <w:t xml:space="preserve">  - Normalize NA/Blank entries; unify casing; trim whitespace; deduplicate entries.</w:t>
-      </w:r>
-    </w:p>
-    <w:p/>
-    <w:p>
-      <w:r>
-        <w:t>Input Raw Data to Question Mapping Logic (Explicit Rules)</w:t>
-      </w:r>
-    </w:p>
-    <w:p>
-      <w:r>
-        <w:t>- IF MatchStatus = “Poor Match” THEN Data Admin must choose:</w:t>
-      </w:r>
-    </w:p>
-    <w:p>
-      <w:r>
-        <w:t xml:space="preserve">  - remove OR mismatch + CorrectedID OR new + New-Question definition.</w:t>
-      </w:r>
-    </w:p>
-    <w:p>
-      <w:r>
-        <w:t>- IF MatchStatus = “Check” THEN Data Admin must confirm accept or treat as mismatch/new.</w:t>
-      </w:r>
-    </w:p>
-    <w:p>
-      <w:r>
-        <w:t>- IF Answer Option Set Mismatch = True THEN force mismatch or new (cannot auto-accept).</w:t>
-      </w:r>
-    </w:p>
-    <w:p>
-      <w:r>
-        <w:t>- IF Vendor code not found in Code Legend THEN raise error; require SIF code correction or legend update.</w:t>
-      </w:r>
-    </w:p>
-    <w:p>
-      <w:r>
-        <w:t>- IF SIF missing (non-product tests) THEN:</w:t>
-      </w:r>
-    </w:p>
-    <w:p>
-      <w:r>
-        <w:t xml:space="preserve">  - Current behavior: workflow breaks (not allowed).</w:t>
-      </w:r>
-    </w:p>
-    <w:p>
-      <w:r>
-        <w:t xml:space="preserve">  - Phase 2 requirement: allow SIF-optional tests with alternate minimal metadata and transformation path.</w:t>
-      </w:r>
-    </w:p>
-    <w:p/>
-    <w:p>
-      <w:r>
-        <w:t>5. Non-Functional Requirements (NFRs) &amp; Data Quality</w:t>
-      </w:r>
-    </w:p>
-    <w:p/>
-    <w:p>
-      <w:r>
-        <w:t>Performance &amp; Scalability</w:t>
-      </w:r>
-    </w:p>
-    <w:p>
-      <w:r>
-        <w:t>- The system must support:</w:t>
-      </w:r>
-    </w:p>
-    <w:p>
-      <w:r>
-        <w:t xml:space="preserve">  - Admin table editors with 700+ questions and 500+ attributes without perceptible lag (target &lt;2 seconds for filter/search, &lt;3 seconds for save).</w:t>
-      </w:r>
-    </w:p>
-    <w:p>
-      <w:r>
-        <w:t xml:space="preserve">  - 20 concurrent users with page responses &lt;3 seconds for common actions (form load, save, list paging).</w:t>
-      </w:r>
-    </w:p>
-    <w:p>
-      <w:r>
-        <w:t xml:space="preserve">  - Vendor uploads up to 50 MB per file with upload completion &lt;30 seconds on standard corporate network.</w:t>
-      </w:r>
-    </w:p>
-    <w:p>
-      <w:r>
-        <w:t>- Availability &amp; Observability</w:t>
-      </w:r>
-    </w:p>
-    <w:p>
-      <w:r>
-        <w:t xml:space="preserve">  - Target uptime ≥ 99.5% monthly.</w:t>
-      </w:r>
-    </w:p>
-    <w:p>
-      <w:r>
-        <w:t xml:space="preserve">  - Implement availability monitoring of app endpoints and alerting to support and Data Admins on outages.</w:t>
-      </w:r>
-    </w:p>
-    <w:p>
-      <w:r>
-        <w:t xml:space="preserve">  - Capture performance telemetry (page load times, API durations), error logs, and user action audit logs.</w:t>
-      </w:r>
-    </w:p>
-    <w:p>
-      <w:r>
-        <w:t>- Security</w:t>
-      </w:r>
-    </w:p>
-    <w:p>
-      <w:r>
-        <w:t xml:space="preserve">  - Mandatory security testing prior to next release:</w:t>
-      </w:r>
-    </w:p>
-    <w:p>
-      <w:r>
-        <w:t xml:space="preserve">    - OWASP Top 10 vulnerability assessment for the Power Apps front-end and any custom connectors.</w:t>
-      </w:r>
-    </w:p>
-    <w:p>
-      <w:r>
-        <w:t xml:space="preserve">    - Authentication and authorization review for external vendor access (consider Azure AD B2B or hardened external identity).</w:t>
-      </w:r>
-    </w:p>
-    <w:p>
-      <w:r>
-        <w:t xml:space="preserve">    - Rate limiting and file upload scanning (antivirus, type/size enforcement).</w:t>
-      </w:r>
-    </w:p>
-    <w:p>
-      <w:r>
-        <w:t xml:space="preserve">    - Penetration testing including brute-force and DDoS simulation (as feasible for platform).</w:t>
-      </w:r>
-    </w:p>
-    <w:p>
-      <w:r>
-        <w:t xml:space="preserve">  - Role-based access control enforcing least privilege.</w:t>
-      </w:r>
-    </w:p>
-    <w:p>
-      <w:r>
-        <w:t xml:space="preserve">  - Audit trail for approvals, bypasses, data edits, and transformation decisions.</w:t>
-      </w:r>
-    </w:p>
-    <w:p>
-      <w:r>
-        <w:t xml:space="preserve">  - Secure data at rest (Azure SQL TDE) and in transit (TLS).</w:t>
-      </w:r>
-    </w:p>
-    <w:p>
-      <w:r>
-        <w:t>- Data Integrity &amp; Quality</w:t>
-      </w:r>
-    </w:p>
-    <w:p>
-      <w:r>
-        <w:t xml:space="preserve">  - Post-completion edits by Data Admin must automatically and reliably propagate to Sensory schema with versioning and audit.</w:t>
-      </w:r>
-    </w:p>
-    <w:p>
-      <w:r>
-        <w:t xml:space="preserve">  - Enforce normalization (NA/blank standardization) and deduplication on controlled domains (e.g., dropdown values).</w:t>
-      </w:r>
-    </w:p>
-    <w:p>
-      <w:r>
-        <w:t xml:space="preserve">  - Referential integrity across TestID, RespondentID, ProductID, QuestionID; reject inconsistent loads.</w:t>
-      </w:r>
-    </w:p>
-    <w:p>
-      <w:r>
-        <w:t xml:space="preserve">  - Validate SIF completeness; prevent invalid dropdown cross-category selections (primary vs secondary vs delivery).</w:t>
-      </w:r>
-    </w:p>
-    <w:p>
-      <w:r>
-        <w:t>- Internationalization</w:t>
-      </w:r>
-    </w:p>
-    <w:p>
-      <w:r>
-        <w:t xml:space="preserve">  - Support global usage (timezone-aware timestamps, locale-agnostic parsing for numeric and date fields in uploads).</w:t>
-      </w:r>
-    </w:p>
-    <w:p/>
-    <w:p>
-      <w:r>
-        <w:t>6. Prioritization Matrix (MoSCoW)</w:t>
-      </w:r>
-    </w:p>
-    <w:p/>
-    <w:p>
-      <w:r>
-        <w:t>Priority | Requirement | Rationale</w:t>
-      </w:r>
-    </w:p>
-    <w:p>
-      <w:r>
-        <w:t>- Must | Pre-Approval before RFP (Req 1.2.1) | Prevents rework and vendor misalignment; addresses governance gap.</w:t>
-      </w:r>
-    </w:p>
-    <w:p>
-      <w:r>
-        <w:t>- Must | Gate Test Conclusion on Transformation Complete (Req 1.13.1) | Prevents loss of ability to correct raw data; safeguards data integrity.</w:t>
-      </w:r>
-    </w:p>
-    <w:p>
-      <w:r>
-        <w:t>- Must | Post-Completion Admin Edits with Propagation | Corrects discovered data issues; aligns reporting with ground truth.</w:t>
-      </w:r>
-    </w:p>
-    <w:p>
-      <w:r>
-        <w:t>- Must | Improve Data Transformation QA (score thresholds, UI, admin actions) (Req 1.11.1) | Current matching rate observed as low as 65%; time-consuming manual checks.</w:t>
-      </w:r>
-    </w:p>
-    <w:p>
-      <w:r>
-        <w:t>- Must | Dropdown category filtering (Primary/Secondary/Delivery) | Prevents frequent data entry errors; reduces cleanup.</w:t>
-      </w:r>
-    </w:p>
-    <w:p>
-      <w:r>
-        <w:t>- Must | Data quality validations (NA/blank normalization, dedupe) | Avoids duplicates and schema pollution.</w:t>
-      </w:r>
-    </w:p>
-    <w:p>
-      <w:r>
-        <w:t>- Must | Security testing &amp; Observability (monitoring/alerts) | External vendor access mandates security posture and uptime visibility.</w:t>
-      </w:r>
-    </w:p>
-    <w:p>
-      <w:r>
-        <w:t>- Should | Multi-user editing on Active Tests | Reflects real-world collaboration; reduces bottlenecks.</w:t>
-      </w:r>
-    </w:p>
-    <w:p>
-      <w:r>
-        <w:t>- Should | SIF bulk copy/paste and SIF export (Excel/PDF) | Significant time saver and transparency for R&amp;D teams.</w:t>
-      </w:r>
-    </w:p>
-    <w:p>
-      <w:r>
-        <w:t>- Should | Improved search/filter for Completed Tests | Speeds retrieval.</w:t>
-      </w:r>
-    </w:p>
-    <w:p>
-      <w:r>
-        <w:t>- Should | Visible file upload status indicators | Eliminates “click-to-discover” frustration; clarity.</w:t>
-      </w:r>
-    </w:p>
-    <w:p>
-      <w:r>
-        <w:t>- Should | One-Pager PPT export; Report PPT generation | Standardizes stakeholder communications.</w:t>
-      </w:r>
-    </w:p>
-    <w:p>
-      <w:r>
-        <w:t>- Could | Internal user/vendor self-service access requests | Reduces platform team emails; streamlines onboarding.</w:t>
-      </w:r>
-    </w:p>
-    <w:p>
-      <w:r>
-        <w:t>- Could | Integration with SAP/Coupa (Vendor master/PO linkage) | Future automation; dependent on enterprise transformations.</w:t>
-      </w:r>
-    </w:p>
-    <w:p>
-      <w:r>
-        <w:t>- Won’t (Phase 2) | Predictive analytics/product formulation prediction | Requires broader product/process/material datasets; slated for future phases.</w:t>
-      </w:r>
-    </w:p>
-    <w:p>
-      <w:r>
-        <w:t>- Won’t (Phase 2) | Supplier ingredient/COA master data (TraceGains integration) | Outside current scope; separate platform better suited.</w:t>
-      </w:r>
-    </w:p>
-    <w:p/>
-    <w:p>
-      <w:r>
-        <w:t>7. Project Scope (In/Out Table)</w:t>
-      </w:r>
-    </w:p>
-    <w:p/>
-    <w:p>
-      <w:r>
-        <w:t>In-Scope (Phase 2)</w:t>
-      </w:r>
-    </w:p>
-    <w:p>
-      <w:r>
-        <w:t>- Sensory UX workflow enhancements: pre-approval gating, vendor re-acknowledgment on changes, conclude-test gating.</w:t>
-      </w:r>
-    </w:p>
-    <w:p>
-      <w:r>
-        <w:t>- Admin post-completion edit and automatic propagation to Sensory schema with audit.</w:t>
-      </w:r>
-    </w:p>
-    <w:p>
-      <w:r>
-        <w:t>- Transformation Engine UI and logic enhancements (score thresholds, bulk review, audit trail).</w:t>
-      </w:r>
-    </w:p>
-    <w:p>
-      <w:r>
-        <w:t>- Dropdown/category filtering corrections for packaging types.</w:t>
-      </w:r>
-    </w:p>
-    <w:p>
-      <w:r>
-        <w:t>- SIF bulk copy/paste; SIF export (Excel/PDF); manage non-product tests (SIF-optional path).</w:t>
-      </w:r>
-    </w:p>
-    <w:p>
-      <w:r>
-        <w:t>- Multi-user collaboration on active tests.</w:t>
-      </w:r>
-    </w:p>
-    <w:p>
-      <w:r>
-        <w:t>- UX improvements: reduce horizontal scrolling, structured page layouts, visible file status, better filters/search.</w:t>
-      </w:r>
-    </w:p>
-    <w:p>
-      <w:r>
-        <w:t>- Security testing, performance baselining, availability monitoring and alerting.</w:t>
-      </w:r>
-    </w:p>
-    <w:p>
-      <w:r>
-        <w:t>- Improved data quality checks (NA/blank normalization; dedupe protections).</w:t>
-      </w:r>
-    </w:p>
-    <w:p>
-      <w:r>
-        <w:t>- Role capability: allow Line Managers to complete full workflow when designated.</w:t>
-      </w:r>
-    </w:p>
-    <w:p/>
-    <w:p>
-      <w:r>
-        <w:t>Out-of-Scope (Phase 3/Future)</w:t>
-      </w:r>
-    </w:p>
-    <w:p>
-      <w:r>
-        <w:t>- Integration with SAP/Coupa (vendor master, PO data).</w:t>
-      </w:r>
-    </w:p>
-    <w:p>
-      <w:r>
-        <w:t>- Supplier ingredient/COA updates via TraceGains or similar.</w:t>
-      </w:r>
-    </w:p>
-    <w:p>
-      <w:r>
-        <w:t>- Predictive analytics for formulation outcomes.</w:t>
-      </w:r>
-    </w:p>
-    <w:p>
-      <w:r>
-        <w:t>- Automated license provisioning workflows beyond basic request/status.</w:t>
-      </w:r>
-    </w:p>
-    <w:p/>
-    <w:p>
-      <w:r>
-        <w:t>8. Conflict Identification &amp; Open Items</w:t>
-      </w:r>
-    </w:p>
-    <w:p/>
-    <w:p>
-      <w:r>
-        <w:t>Conflicts/Technical Disagreements</w:t>
-      </w:r>
-    </w:p>
-    <w:p>
-      <w:r>
-        <w:t>- Table UI feasibility in Power Apps:</w:t>
-      </w:r>
-    </w:p>
-    <w:p>
-      <w:r>
-        <w:t xml:space="preserve">  - Vendor claims table format for managing 700 questions/500 attributes is impractical and will be slow; stakeholders require table-based admin with filters and bulk operations.</w:t>
-      </w:r>
-    </w:p>
-    <w:p>
-      <w:r>
-        <w:t>- Transformation Engine “learning”:</w:t>
-      </w:r>
-    </w:p>
-    <w:p>
-      <w:r>
-        <w:t xml:space="preserve">  - Vendor originally indicated matching rate would improve via supervised training; stakeholders observe no improvement over time, matching sometimes ~65%. Vendor now states model is static.</w:t>
-      </w:r>
-    </w:p>
-    <w:p>
-      <w:r>
-        <w:t>- UX constraints:</w:t>
-      </w:r>
-    </w:p>
-    <w:p>
-      <w:r>
-        <w:t xml:space="preserve">  - Vendor asserted Power Apps layout limitations justify horizontal/vertical scrolling; stakeholders require reduced scrolling and improved navigation.</w:t>
-      </w:r>
-    </w:p>
-    <w:p>
-      <w:r>
-        <w:t>- Post-completion edits:</w:t>
-      </w:r>
-    </w:p>
-    <w:p>
-      <w:r>
-        <w:t xml:space="preserve">  - Current design blocks edits propagating to Sensory schema; stakeholders require post-completion edit capability with downstream reflection.</w:t>
-      </w:r>
-    </w:p>
-    <w:p/>
-    <w:p>
-      <w:r>
-        <w:t>Open Items/Decisions Needed</w:t>
-      </w:r>
-    </w:p>
-    <w:p>
-      <w:r>
-        <w:t>- Define exact transformation score thresholds (Exact_Threshold, Review_Low, Review_High, Poor_Threshold) and default actions.</w:t>
-      </w:r>
-    </w:p>
-    <w:p>
-      <w:r>
-        <w:t>- Confirm external auth model (remain email-based IDs vs adopt Azure AD B2B) with Security/IT.</w:t>
-      </w:r>
-    </w:p>
-    <w:p>
-      <w:r>
-        <w:t>- Confirm non-product test workflow: minimal required metadata, downstream transformation path, and reporting behavior.</w:t>
-      </w:r>
-    </w:p>
-    <w:p>
-      <w:r>
-        <w:t>- Define audit log retention and access (who can view/ export).</w:t>
-      </w:r>
-    </w:p>
-    <w:p>
-      <w:r>
-        <w:t>- Clarify concurrency/locking model for multi-user editing on the same test (optimistic locking, field-level locks, or check-in/check-out).</w:t>
-      </w:r>
-    </w:p>
-    <w:p>
-      <w:r>
-        <w:t>- Specify SIF export formats and templates; confirm required columns for Excel export.</w:t>
-      </w:r>
-    </w:p>
-    <w:p>
-      <w:r>
-        <w:t>- Determine monitoring/alerting tooling and ownership (who is paged, thresholds, SLAs).</w:t>
-      </w:r>
-    </w:p>
-    <w:p>
-      <w:r>
-        <w:t>- Establish performance test plan (concurrency targets, scenarios).</w:t>
-      </w:r>
-    </w:p>
-    <w:p>
-      <w:r>
-        <w:t>- Confirm Line Manager expanded permissions and any governance constraints.</w:t>
-      </w:r>
-    </w:p>
-    <w:p>
-      <w:r>
-        <w:t>- Confirm One-Pager and Report PPT templates and field-to-slide mappings.</w:t>
-      </w:r>
-    </w:p>
-    <w:p/>
-    <w:p>
-      <w:r>
-        <w:t>Detailed Functional Additions (Phase 2 Backlog Items Mapped to Transcript)</w:t>
-      </w:r>
-    </w:p>
-    <w:p>
-      <w:r>
-        <w:t>- Pre-Approval One-Pager before RFP; vendor re-ack on scope changes.</w:t>
-      </w:r>
-    </w:p>
-    <w:p>
-      <w:r>
-        <w:t>- Data Admin post-completion edit capability with propagation to Sensory schema.</w:t>
-      </w:r>
-    </w:p>
-    <w:p>
-      <w:r>
-        <w:t>- Transformation Engine:</w:t>
-      </w:r>
-    </w:p>
-    <w:p>
-      <w:r>
-        <w:t xml:space="preserve">  - Mapping UI with statuses (Exact/Check/Poor), score display, bulk resolve; enforce admin decisions (“remove”, “mismatch + ID”, “new + definition”).</w:t>
-      </w:r>
-    </w:p>
-    <w:p>
-      <w:r>
-        <w:t xml:space="preserve">  - Category-to-attribute mapping management UI.</w:t>
-      </w:r>
-    </w:p>
-    <w:p>
-      <w:r>
-        <w:t>- Non-Product Tests: SIF-optional path without breaking workflow.</w:t>
-      </w:r>
-    </w:p>
-    <w:p>
-      <w:r>
-        <w:t>- Multi-Editor: Allow multiple Sensory team members to work on active tests.</w:t>
-      </w:r>
-    </w:p>
-    <w:p>
-      <w:r>
-        <w:t>- Bulk SIF copy/paste from Excel; SIF export to Excel/PDF.</w:t>
-      </w:r>
-    </w:p>
-    <w:p>
-      <w:r>
-        <w:t>- File upload visibility: inline “Uploaded/Missing” icons; file names and timestamps.</w:t>
-      </w:r>
-    </w:p>
-    <w:p>
-      <w:r>
-        <w:t>- Dropdown filtering corrections for packaging types.</w:t>
-      </w:r>
-    </w:p>
-    <w:p>
-      <w:r>
-        <w:t>- Improved completed test search/filtering.</w:t>
-      </w:r>
-    </w:p>
-    <w:p>
-      <w:r>
-        <w:t>- One-Pager PPT export; auto-generate report PPT from standardized fields.</w:t>
-      </w:r>
-    </w:p>
-    <w:p>
-      <w:r>
-        <w:t>- UX remediation: reduce horizontal scrolling, improve layout and navigation.</w:t>
-      </w:r>
-    </w:p>
-    <w:p>
-      <w:r>
-        <w:t>- Data quality: normalize NA/blank, prevent duplicate domain entries, standard validations before saving to SQL.</w:t>
-      </w:r>
-    </w:p>
-    <w:p>
-      <w:r>
-        <w:t>- Role enhancement: permit Line Managers to complete full test workflows.</w:t>
-      </w:r>
-    </w:p>
-    <w:p>
-      <w:r>
-        <w:t>- Admin dropdown/category maintenance via table UI with filters and bulk edit.</w:t>
-      </w:r>
-    </w:p>
-    <w:p/>
-    <w:p>
-      <w:r>
-        <w:t>Appendix: Current System Facts from Transcript (Traceability)</w:t>
-      </w:r>
-    </w:p>
-    <w:p>
-      <w:r>
-        <w:t>- Architecture: Stakeholder Portal, Vendor Portal, Transformation Module.</w:t>
-      </w:r>
-    </w:p>
-    <w:p>
-      <w:r>
-        <w:t>- Roles and access delineated; vendors limited; internal users see own tests and peers’ completed tests; admins see all.</w:t>
-      </w:r>
-    </w:p>
-    <w:p>
-      <w:r>
-        <w:t>- Notifications: Emails when vendors submit; approval cycles for One-Pager and reports.</w:t>
-      </w:r>
-    </w:p>
-    <w:p>
-      <w:r>
-        <w:t>- SIF: Product info, cooking instructions, holding/delivery protocols; vendor enters codes; equipment lists extendable by vendor; micro clearance by R&amp;D lead.</w:t>
-      </w:r>
-    </w:p>
-    <w:p>
-      <w:r>
-        <w:t>- Data flow: App writes to RND (holding) tables during workflow; only on completion push to Sensory schema; Power BI reads Sensory schema.</w:t>
-      </w:r>
-    </w:p>
-    <w:p>
-      <w:r>
-        <w:t>- Data size: 35 total tables; 19 original sensory; additional app tables; 700+ questions, 500+ attributes to manage.</w:t>
-      </w:r>
-    </w:p>
-    <w:p>
-      <w:r>
-        <w:t>- Issues: UX basic with extensive scrolling; invisible link statuses; no bulk SIF paste; no SIF export; non-product tests not supported; only one user can edit an active test; post-completion edits don’t flow to reporting tables; transformation matching not improving; manual vendor and user provisioning via emails; reactive incident support (≈45 tracked incidents since go-live).</w:t>
-      </w:r>
-    </w:p>
-    <w:p>
-      <w:r>
-        <w:t>- Go-Live: March 2025 (effective); 3 months in production at time of meeting; users are global; expected 50–100 users in Year 1.</w:t>
-      </w:r>
-    </w:p>
-    <w:p/>
-    <w:p>
-      <w:r>
-        <w:t>This document removes conversational filler and translates stakeholder pain points into explicit, testable requirements and rules to guide Phase 2 delivery and governance.</w:t>
+        <w:t>Brownfield notes used: Final Sensory Workflow - Flow Diagram.pdf.</w:t>
       </w:r>
     </w:p>
     <w:sectPr>

</xml_diff>